<commit_message>
Update value proposition doc with Speed section and 10-row user table
Adds Energy Advisors & Retrofit Coordinators and Mortgage Advisors to
the Who Uses It table. Adds Speed section highlighting how PlanitBER
removes friction from grant and loan application processes.

https://claude.ai/code/session_017c6VtAdYwGJhpVqbEFh3tW
</commit_message>
<xml_diff>
--- a/PlanitBER_Value_Proposition.docx
+++ b/PlanitBER_Value_Proposition.docx
@@ -3,9 +3,6 @@
 <w:document xmlns:wpc="http://schemas.microsoft.com/office/word/2010/wordprocessingCanvas" xmlns:mo="http://schemas.microsoft.com/office/mac/office/2008/main" xmlns:mc="http://schemas.openxmlformats.org/markup-compatibility/2006" xmlns:mv="urn:schemas-microsoft-com:mac:vml" xmlns:o="urn:schemas-microsoft-com:office:office" xmlns:r="http://schemas.openxmlformats.org/officeDocument/2006/relationships" xmlns:m="http://schemas.openxmlformats.org/officeDocument/2006/math" xmlns:v="urn:schemas-microsoft-com:vml" xmlns:wp14="http://schemas.microsoft.com/office/word/2010/wordprocessingDrawing" xmlns:wp="http://schemas.openxmlformats.org/drawingml/2006/wordprocessingDrawing" xmlns:w10="urn:schemas-microsoft-com:office:word" xmlns:w="http://schemas.openxmlformats.org/wordprocessingml/2006/main" xmlns:w14="http://schemas.microsoft.com/office/word/2010/wordml" xmlns:wpg="http://schemas.microsoft.com/office/word/2010/wordprocessingGroup" xmlns:wpi="http://schemas.microsoft.com/office/word/2010/wordprocessingInk" xmlns:wne="http://schemas.microsoft.com/office/word/2006/wordml" xmlns:wps="http://schemas.microsoft.com/office/word/2010/wordprocessingShape" mc:Ignorable="w14 wp14">
   <w:body>
     <w:p>
-      <w:pPr>
-        <w:jc w:val="left"/>
-      </w:pPr>
       <w:r>
         <w:rPr>
           <w:b/>
@@ -118,7 +115,7 @@
           <w:color w:val="475569"/>
           <w:sz w:val="20"/>
         </w:rPr>
-        <w:t>A BER assessment recommends measures but provides no budget. Homeowners don't know if an upgrade will cost €8,000 or €80,000. Without a credible number they don't apply for grants, don't approach banks, and don't proceed. SEAI spends heavily on awareness — the conversion from "interested" to "committed" breaks down at the budget question.</w:t>
+        <w:t>A BER assessment recommends measures but provides no budget. Homeowners don't know if an upgrade will cost €8,000 or €80,000. Without a credible number they don't apply for grants, don't approach banks, and don't proceed.</w:t>
       </w:r>
     </w:p>
     <w:p>
@@ -140,7 +137,7 @@
           <w:color w:val="475569"/>
           <w:sz w:val="20"/>
         </w:rPr>
-        <w:t>A widespread perception — well-founded in some cases — that contractors price to the gross figure and pocket the grant, leaving the homeowner no better off. This actively suppresses uptake. Homeowners who feel the grant is a contractor bonus rather than a real saving will not participate.</w:t>
+        <w:t>A widespread perception — well-founded in some cases — that contractors price to the gross figure and pocket the grant, leaving the homeowner no better off. This actively suppresses uptake.</w:t>
       </w:r>
     </w:p>
     <w:p>
@@ -162,7 +159,7 @@
           <w:color w:val="475569"/>
           <w:sz w:val="20"/>
         </w:rPr>
-        <w:t>A BER assessor visits, rates the home, recommends measures, and leaves. There is no fast, credible way to turn that recommendation into a project budget during or immediately after the visit. The window where a homeowner is most motivated to act closes before they have the information they need.</w:t>
+        <w:t>A BER assessor visits, rates the home, recommends measures, and leaves. There is no fast, credible way to turn that recommendation into a project budget. The window where a homeowner is most motivated to act closes before they have the information they need.</w:t>
       </w:r>
     </w:p>
     <w:p>
@@ -250,7 +247,7 @@
           <w:color w:val="475569"/>
           <w:sz w:val="20"/>
         </w:rPr>
-        <w:t>The BOQ shows gross costs independently of any contractor. Grants are shown line by line. The document states explicitly: "Contractors should quote on the gross costs above — SEAI grants should reduce your invoice, not justify inflated pricing." A homeowner who has an independent BOQ before engaging a contractor is in a fundamentally stronger position.</w:t>
+        <w:t>The BOQ shows gross costs independently of any contractor. Grants are shown line by line. The document states: "Contractors should quote on the gross costs above — SEAI grants should reduce your invoice, not justify inflated pricing."</w:t>
       </w:r>
     </w:p>
     <w:p>
@@ -273,6 +270,122 @@
           <w:sz w:val="20"/>
         </w:rPr>
         <w:t>A BER assessor can generate a complete cost plan during the assessment visit and hand it to the homeowner alongside the BER certificate. The gap between recommendation and budget closes to zero.</w:t>
+      </w:r>
+    </w:p>
+    <w:p>
+      <w:pPr>
+        <w:spacing w:before="80" w:after="80"/>
+        <w:pBdr>
+          <w:bottom w:val="single" w:sz="6" w:space="1" w:color="E8A020"/>
+        </w:pBdr>
+      </w:pPr>
+    </w:p>
+    <w:p>
+      <w:pPr>
+        <w:pStyle w:val="Heading1"/>
+        <w:jc w:val="left"/>
+      </w:pPr>
+      <w:r>
+        <w:rPr>
+          <w:color w:val="1A2332"/>
+        </w:rPr>
+        <w:t>Speed — Removing Friction from the Process</w:t>
+      </w:r>
+    </w:p>
+    <w:p>
+      <w:pPr>
+        <w:spacing w:after="120"/>
+      </w:pPr>
+      <w:r>
+        <w:rPr>
+          <w:color w:val="475569"/>
+          <w:sz w:val="20"/>
+        </w:rPr>
+        <w:t>Every week of delay between a homeowner deciding they want to retrofit and actually committing is a week they can talk themselves out of it. Speed is not a convenience feature — it directly affects conversion rate, which is the core metric SEAI is struggling with.</w:t>
+      </w:r>
+    </w:p>
+    <w:p>
+      <w:pPr>
+        <w:spacing w:before="80" w:after="40"/>
+        <w:ind w:left="227"/>
+      </w:pPr>
+      <w:r>
+        <w:rPr>
+          <w:b/>
+          <w:color w:val="1A2332"/>
+          <w:sz w:val="20"/>
+        </w:rPr>
+        <w:t xml:space="preserve">Grant applications: </w:t>
+      </w:r>
+      <w:r>
+        <w:rPr>
+          <w:color w:val="475569"/>
+          <w:sz w:val="20"/>
+        </w:rPr>
+        <w:t>SEAI requires cost evidence before approval. Today that means waiting for contractor quotes — adding weeks of friction before anything can be formally submitted. An independent BOQ available instantly means the grant application can go in the same week the homeowner decides to proceed.</w:t>
+      </w:r>
+    </w:p>
+    <w:p>
+      <w:pPr>
+        <w:spacing w:before="80" w:after="40"/>
+        <w:ind w:left="227"/>
+      </w:pPr>
+      <w:r>
+        <w:rPr>
+          <w:b/>
+          <w:color w:val="1A2332"/>
+          <w:sz w:val="20"/>
+        </w:rPr>
+        <w:t xml:space="preserve">Bank and loan applications: </w:t>
+      </w:r>
+      <w:r>
+        <w:rPr>
+          <w:color w:val="475569"/>
+          <w:sz w:val="20"/>
+        </w:rPr>
+        <w:t>Homeowners are caught in a loop — can't get a loan without a quote, won't approach contractors without knowing if they can afford it, won't apply for a grant without a loan confirmed. PlanitBER breaks that loop by providing a credible number at the start of the process rather than the end.</w:t>
+      </w:r>
+    </w:p>
+    <w:p>
+      <w:pPr>
+        <w:spacing w:before="80" w:after="40"/>
+        <w:ind w:left="227"/>
+      </w:pPr>
+      <w:r>
+        <w:rPr>
+          <w:b/>
+          <w:color w:val="1A2332"/>
+          <w:sz w:val="20"/>
+        </w:rPr>
+        <w:t xml:space="preserve">BER assessor visits: </w:t>
+      </w:r>
+      <w:r>
+        <w:rPr>
+          <w:color w:val="475569"/>
+          <w:sz w:val="20"/>
+        </w:rPr>
+        <w:t>Currently the assessor leaves with no budget conversation possible. The homeowner waits weeks for contractor quotes before they can act. With PlanitBER the cost conversation happens at the visit — motivation and information arrive together.</w:t>
+      </w:r>
+    </w:p>
+    <w:p>
+      <w:pPr>
+        <w:spacing w:before="80" w:after="40"/>
+        <w:ind w:left="227"/>
+      </w:pPr>
+      <w:r>
+        <w:rPr>
+          <w:b/>
+          <w:color w:val="1A2332"/>
+          <w:sz w:val="20"/>
+        </w:rPr>
+        <w:t xml:space="preserve">One Stop Shop pipeline: </w:t>
+      </w:r>
+      <w:r>
+        <w:rPr>
+          <w:color w:val="475569"/>
+          <w:sz w:val="20"/>
+        </w:rPr>
+        <w:t>If a homeowner arrives with an indicative BOQ already in hand, the OSS can pre-qualify the project and prioritise their survey pipeline more efficiently — reducing time-to-survey for serious applicants.</w:t>
       </w:r>
     </w:p>
     <w:p>
@@ -555,7 +668,7 @@
               <w:rPr>
                 <w:sz w:val="18"/>
               </w:rPr>
-              <w:t>Generate instant indicative costs during assessment visits. Turn a certificate into a complete budget conversation.</w:t>
+              <w:t>Generate instant indicative costs during assessment visits. Turn a certificate into a complete budget conversation at the point of highest motivation.</w:t>
             </w:r>
           </w:p>
         </w:tc>
@@ -587,7 +700,7 @@
               <w:rPr>
                 <w:sz w:val="18"/>
               </w:rPr>
-              <w:t>Credible cost document for green loan and mortgage applications. Independent of the contractor.</w:t>
+              <w:t>Credible cost document for green loan and mortgage applications. Independent of the contractor — breaks the quote loop that delays applications.</w:t>
             </w:r>
           </w:p>
         </w:tc>
@@ -617,7 +730,7 @@
               <w:rPr>
                 <w:sz w:val="18"/>
               </w:rPr>
-              <w:t>Quick feasibility cost before committing to a full survey. Pre-qualify projects efficiently.</w:t>
+              <w:t>Quick feasibility cost before committing to a full survey. Pre-qualify projects efficiently and prioritise the survey pipeline.</w:t>
             </w:r>
           </w:p>
         </w:tc>
@@ -649,7 +762,7 @@
               <w:rPr>
                 <w:sz w:val="18"/>
               </w:rPr>
-              <w:t>Structured scope-of-works document to quote from. Published rate basis for benchmarking.</w:t>
+              <w:t>Structured scope-of-works document to quote from. Published rate basis for benchmarking and demonstrating value.</w:t>
             </w:r>
           </w:p>
         </w:tc>
@@ -711,7 +824,7 @@
               <w:rPr>
                 <w:sz w:val="18"/>
               </w:rPr>
-              <w:t>Real-market cost data to calibrate grant rates. Understand project costs across the programme.</w:t>
+              <w:t>Real-market cost data to calibrate grant rates. Understand project costs across the programme. Supports conversion from assessment to action.</w:t>
             </w:r>
           </w:p>
         </w:tc>
@@ -741,7 +854,69 @@
               <w:rPr>
                 <w:sz w:val="18"/>
               </w:rPr>
-              <w:t>Show upgrade costs on property listings. Retrofit cost disclosure in transactions.</w:t>
+              <w:t>Show upgrade costs on property listings. Retrofit cost disclosure in transactions as BER ratings increasingly affect property values.</w:t>
+            </w:r>
+          </w:p>
+        </w:tc>
+      </w:tr>
+      <w:tr>
+        <w:tc>
+          <w:tcPr>
+            <w:tcW w:type="dxa" w:w="2551"/>
+            <w:shd w:val="clear" w:color="auto" w:fill="F8FAFC"/>
+          </w:tcPr>
+          <w:p>
+            <w:r>
+              <w:rPr>
+                <w:b/>
+                <w:color w:val="1A2332"/>
+                <w:sz w:val="18"/>
+              </w:rPr>
+              <w:t>Energy Advisors &amp; Retrofit Coordinators</w:t>
+            </w:r>
+          </w:p>
+        </w:tc>
+        <w:tc>
+          <w:tcPr>
+            <w:tcW w:type="dxa" w:w="6520"/>
+            <w:shd w:val="clear" w:color="auto" w:fill="F8FAFC"/>
+          </w:tcPr>
+          <w:p>
+            <w:r>
+              <w:rPr>
+                <w:sz w:val="18"/>
+              </w:rPr>
+              <w:t>Model different upgrade scenarios and costs. Support client education, project sequencing, and phased works planning.</w:t>
+            </w:r>
+          </w:p>
+        </w:tc>
+      </w:tr>
+      <w:tr>
+        <w:tc>
+          <w:tcPr>
+            <w:tcW w:type="dxa" w:w="2551"/>
+          </w:tcPr>
+          <w:p>
+            <w:r>
+              <w:rPr>
+                <w:b/>
+                <w:color w:val="1A2332"/>
+                <w:sz w:val="18"/>
+              </w:rPr>
+              <w:t>Mortgage Advisors</w:t>
+            </w:r>
+          </w:p>
+        </w:tc>
+        <w:tc>
+          <w:tcPr>
+            <w:tcW w:type="dxa" w:w="6520"/>
+          </w:tcPr>
+          <w:p>
+            <w:r>
+              <w:rPr>
+                <w:sz w:val="18"/>
+              </w:rPr>
+              <w:t>Model the investment case — upgrade cost vs. green mortgage rate saving vs. annual energy saving. Size green top-up loans accurately.</w:t>
             </w:r>
           </w:p>
         </w:tc>
@@ -777,7 +952,7 @@
           <w:color w:val="475569"/>
           <w:sz w:val="20"/>
         </w:rPr>
-        <w:t>This is not a contractor quote. It is not a generic online estimator. It is an independent, geometry-driven cost plan aligned to DEAP measures, SEAI grant structure, and current Irish market rates — produced in the same format a quantity surveyor would use.</w:t>
+        <w:t>This is not a contractor quote. It is not a generic online estimator. It is an independent, geometry-driven cost plan aligned to DEAP measures, SEAI grant structure, and current Irish market rates — produced in the same format a quantity surveyor would use, available instantly, at no cost to the homeowner.</w:t>
       </w:r>
     </w:p>
     <w:p>

</xml_diff>

<commit_message>
Regenerate value proposition docx from updated markdown
Co-Authored-By: Claude Fable 5 <noreply@anthropic.com>
Claude-Session: https://claude.ai/code/session_017c6VtAdYwGJhpVqbEFh3tW
</commit_message>
<xml_diff>
--- a/PlanitBER_Value_Proposition.docx
+++ b/PlanitBER_Value_Proposition.docx
@@ -6,290 +6,10 @@
       <w:r>
         <w:rPr>
           <w:b/>
-          <w:color w:val="1A2332"/>
-          <w:sz w:val="56"/>
+          <w:color w:val="1E293B"/>
+          <w:sz w:val="44"/>
         </w:rPr>
-        <w:t>PlanitBER</w:t>
-      </w:r>
-    </w:p>
-    <w:p>
-      <w:pPr>
-        <w:spacing w:after="40"/>
-      </w:pPr>
-      <w:r>
-        <w:rPr>
-          <w:b/>
-          <w:color w:val="E8A020"/>
-          <w:sz w:val="28"/>
-        </w:rPr>
-        <w:t>Value Proposition</w:t>
-      </w:r>
-    </w:p>
-    <w:p>
-      <w:pPr>
-        <w:spacing w:after="40"/>
-      </w:pPr>
-      <w:r>
-        <w:rPr>
-          <w:i/>
-          <w:color w:val="475569"/>
-          <w:sz w:val="20"/>
-        </w:rPr>
-        <w:t>An independent, instant Bill of Quantities for Ireland's home retrofit market.</w:t>
-      </w:r>
-    </w:p>
-    <w:p>
-      <w:pPr>
-        <w:spacing w:after="160"/>
-      </w:pPr>
-      <w:r>
-        <w:rPr>
-          <w:b/>
-          <w:color w:val="1A2332"/>
-          <w:sz w:val="20"/>
-        </w:rPr>
-        <w:t>Turns a BER certificate into an actionable budget in under two minutes.</w:t>
-      </w:r>
-    </w:p>
-    <w:p>
-      <w:pPr>
-        <w:spacing w:before="80" w:after="80"/>
-        <w:pBdr>
-          <w:bottom w:val="single" w:sz="6" w:space="1" w:color="E8A020"/>
-        </w:pBdr>
-      </w:pPr>
-    </w:p>
-    <w:p>
-      <w:pPr>
-        <w:pStyle w:val="Heading1"/>
-        <w:jc w:val="left"/>
-      </w:pPr>
-      <w:r>
-        <w:rPr>
-          <w:color w:val="1A2332"/>
-        </w:rPr>
-        <w:t>The Problem</w:t>
-      </w:r>
-    </w:p>
-    <w:p>
-      <w:pPr>
-        <w:spacing w:after="160"/>
-      </w:pPr>
-      <w:r>
-        <w:rPr>
-          <w:sz w:val="20"/>
-        </w:rPr>
-        <w:t xml:space="preserve">Ireland has committed to retrofitting </w:t>
-      </w:r>
-      <w:r>
-        <w:rPr>
-          <w:b/>
-          <w:color w:val="E8A020"/>
-          <w:sz w:val="20"/>
-        </w:rPr>
-        <w:t>500,000 homes to B2 or better by 2030</w:t>
-      </w:r>
-      <w:r>
-        <w:rPr>
-          <w:sz w:val="20"/>
-        </w:rPr>
-        <w:t>. Current completion rates are well behind target. Three demand-side barriers explain why:</w:t>
-      </w:r>
-    </w:p>
-    <w:p>
-      <w:pPr>
-        <w:spacing w:before="120" w:after="40"/>
-        <w:ind w:left="227"/>
-      </w:pPr>
-      <w:r>
-        <w:rPr>
-          <w:b/>
-          <w:color w:val="1A2332"/>
-          <w:sz w:val="20"/>
-        </w:rPr>
-        <w:t>1.  Cost uncertainty stops homeowners acting.</w:t>
-        <w:br/>
-      </w:r>
-      <w:r>
-        <w:rPr>
-          <w:color w:val="475569"/>
-          <w:sz w:val="20"/>
-        </w:rPr>
-        <w:t>A BER assessment recommends measures but provides no budget. Homeowners don't know if an upgrade will cost €8,000 or €80,000. Without a credible number they don't apply for grants, don't approach banks, and don't proceed.</w:t>
-      </w:r>
-    </w:p>
-    <w:p>
-      <w:pPr>
-        <w:spacing w:before="120" w:after="40"/>
-        <w:ind w:left="227"/>
-      </w:pPr>
-      <w:r>
-        <w:rPr>
-          <w:b/>
-          <w:color w:val="1A2332"/>
-          <w:sz w:val="20"/>
-        </w:rPr>
-        <w:t>2.  Grant inflation erodes trust in the scheme.</w:t>
-        <w:br/>
-      </w:r>
-      <w:r>
-        <w:rPr>
-          <w:color w:val="475569"/>
-          <w:sz w:val="20"/>
-        </w:rPr>
-        <w:t>A widespread perception — well-founded in some cases — that contractors price to the gross figure and pocket the grant, leaving the homeowner no better off. This actively suppresses uptake.</w:t>
-      </w:r>
-    </w:p>
-    <w:p>
-      <w:pPr>
-        <w:spacing w:before="120" w:after="40"/>
-        <w:ind w:left="227"/>
-      </w:pPr>
-      <w:r>
-        <w:rPr>
-          <w:b/>
-          <w:color w:val="1A2332"/>
-          <w:sz w:val="20"/>
-        </w:rPr>
-        <w:t>3.  No bridge between assessment and action.</w:t>
-        <w:br/>
-      </w:r>
-      <w:r>
-        <w:rPr>
-          <w:color w:val="475569"/>
-          <w:sz w:val="20"/>
-        </w:rPr>
-        <w:t>A BER assessor visits, rates the home, recommends measures, and leaves. There is no fast, credible way to turn that recommendation into a project budget. The window where a homeowner is most motivated to act closes before they have the information they need.</w:t>
-      </w:r>
-    </w:p>
-    <w:p>
-      <w:pPr>
-        <w:spacing w:before="80" w:after="80"/>
-        <w:pBdr>
-          <w:bottom w:val="single" w:sz="6" w:space="1" w:color="E8A020"/>
-        </w:pBdr>
-      </w:pPr>
-    </w:p>
-    <w:p>
-      <w:pPr>
-        <w:pStyle w:val="Heading1"/>
-        <w:jc w:val="left"/>
-      </w:pPr>
-      <w:r>
-        <w:rPr>
-          <w:color w:val="1A2332"/>
-        </w:rPr>
-        <w:t>How PlanitBER Solves This</w:t>
-      </w:r>
-    </w:p>
-    <w:p>
-      <w:pPr>
-        <w:spacing w:after="160"/>
-      </w:pPr>
-      <w:r>
-        <w:rPr>
-          <w:sz w:val="20"/>
-        </w:rPr>
-        <w:t xml:space="preserve">PlanitBER generates an itemised, independent Bill of Quantities from DEAP survey geometry and a works selector. It is </w:t>
-      </w:r>
-      <w:r>
-        <w:rPr>
-          <w:b/>
-          <w:sz w:val="20"/>
-        </w:rPr>
-        <w:t>not prepared by the contractor</w:t>
-      </w:r>
-      <w:r>
-        <w:rPr>
-          <w:sz w:val="20"/>
-        </w:rPr>
-        <w:t xml:space="preserve"> — it is derived from the same data the BER assessor already holds.</w:t>
-      </w:r>
-    </w:p>
-    <w:p>
-      <w:pPr>
-        <w:spacing w:before="100" w:after="40"/>
-        <w:ind w:left="227"/>
-      </w:pPr>
-      <w:r>
-        <w:rPr>
-          <w:b/>
-          <w:color w:val="059669"/>
-          <w:sz w:val="20"/>
-        </w:rPr>
-        <w:t>Solves problem 1 — cost certainty:</w:t>
-        <w:br/>
-      </w:r>
-      <w:r>
-        <w:rPr>
-          <w:color w:val="475569"/>
-          <w:sz w:val="20"/>
-        </w:rPr>
-        <w:t>Instant indicative budget, section by section, with county-adjusted labour rates and current Irish material prices. Homeowner leaves the assessment knowing what the upgrade will cost.</w:t>
-      </w:r>
-    </w:p>
-    <w:p>
-      <w:pPr>
-        <w:spacing w:before="100" w:after="40"/>
-        <w:ind w:left="227"/>
-      </w:pPr>
-      <w:r>
-        <w:rPr>
-          <w:b/>
-          <w:color w:val="059669"/>
-          <w:sz w:val="20"/>
-        </w:rPr>
-        <w:t>Solves problem 2 — grant trust:</w:t>
-        <w:br/>
-      </w:r>
-      <w:r>
-        <w:rPr>
-          <w:color w:val="475569"/>
-          <w:sz w:val="20"/>
-        </w:rPr>
-        <w:t>The BOQ shows gross costs independently of any contractor. Grants are shown line by line. The document states: "Contractors should quote on the gross costs above — SEAI grants should reduce your invoice, not justify inflated pricing."</w:t>
-      </w:r>
-    </w:p>
-    <w:p>
-      <w:pPr>
-        <w:spacing w:before="100" w:after="40"/>
-        <w:ind w:left="227"/>
-      </w:pPr>
-      <w:r>
-        <w:rPr>
-          <w:b/>
-          <w:color w:val="059669"/>
-          <w:sz w:val="20"/>
-        </w:rPr>
-        <w:t>Solves problem 3 — assessment to action:</w:t>
-        <w:br/>
-      </w:r>
-      <w:r>
-        <w:rPr>
-          <w:color w:val="475569"/>
-          <w:sz w:val="20"/>
-        </w:rPr>
-        <w:t>A BER assessor can generate a complete cost plan during the assessment visit and hand it to the homeowner alongside the BER certificate. The gap between recommendation and budget closes to zero.</w:t>
-      </w:r>
-    </w:p>
-    <w:p>
-      <w:pPr>
-        <w:spacing w:before="80" w:after="80"/>
-        <w:pBdr>
-          <w:bottom w:val="single" w:sz="6" w:space="1" w:color="E8A020"/>
-        </w:pBdr>
-      </w:pPr>
-    </w:p>
-    <w:p>
-      <w:pPr>
-        <w:pStyle w:val="Heading1"/>
-        <w:jc w:val="left"/>
-      </w:pPr>
-      <w:r>
-        <w:rPr>
-          <w:color w:val="1A2332"/>
-        </w:rPr>
-        <w:t>Speed — Removing Friction from the Process</w:t>
+        <w:t>PlanitBER — Value Proposition</w:t>
       </w:r>
     </w:p>
     <w:p>
@@ -298,297 +18,319 @@
       </w:pPr>
       <w:r>
         <w:rPr>
-          <w:color w:val="475569"/>
-          <w:sz w:val="20"/>
+          <w:b/>
+          <w:color w:val="1E293B"/>
         </w:rPr>
-        <w:t>Every week of delay between a homeowner deciding they want to retrofit and actually committing is a week they can talk themselves out of it. Speed is not a convenience feature — it directly affects conversion rate, which is the core metric SEAI is struggling with.</w:t>
+        <w:t>The cost layer Ireland's retrofit programme is missing.</w:t>
       </w:r>
     </w:p>
     <w:p>
       <w:pPr>
-        <w:spacing w:before="80" w:after="40"/>
-        <w:ind w:left="227"/>
+        <w:spacing w:after="120"/>
+      </w:pPr>
+      <w:r>
+        <w:t>PlanitBER turns a BER assessment into an independent, grant-netted, finance-ready budget in under two minutes — the same data the assessor already holds, priced in the format a quantity surveyor would use.</w:t>
+      </w:r>
+    </w:p>
+    <w:p>
+      <w:pPr>
+        <w:spacing w:before="280" w:after="80"/>
       </w:pPr>
       <w:r>
         <w:rPr>
           <w:b/>
-          <w:color w:val="1A2332"/>
-          <w:sz w:val="20"/>
+          <w:color w:val="B07D1A"/>
+          <w:sz w:val="30"/>
         </w:rPr>
-        <w:t xml:space="preserve">Grant applications: </w:t>
-      </w:r>
-      <w:r>
-        <w:rPr>
-          <w:color w:val="475569"/>
-          <w:sz w:val="20"/>
-        </w:rPr>
-        <w:t>SEAI requires cost evidence before approval. Today that means waiting for contractor quotes — adding weeks of friction before anything can be formally submitted. An independent BOQ available instantly means the grant application can go in the same week the homeowner decides to proceed.</w:t>
+        <w:t>1. What It Is</w:t>
       </w:r>
     </w:p>
     <w:p>
       <w:pPr>
-        <w:spacing w:before="80" w:after="40"/>
-        <w:ind w:left="227"/>
+        <w:spacing w:before="200" w:after="60"/>
       </w:pPr>
       <w:r>
         <w:rPr>
           <w:b/>
-          <w:color w:val="1A2332"/>
-          <w:sz w:val="20"/>
+          <w:color w:val="1E293B"/>
+          <w:sz w:val="24"/>
         </w:rPr>
-        <w:t xml:space="preserve">Bank and loan applications: </w:t>
-      </w:r>
-      <w:r>
-        <w:rPr>
-          <w:color w:val="475569"/>
-          <w:sz w:val="20"/>
-        </w:rPr>
-        <w:t>Homeowners are caught in a loop — can't get a loan without a quote, won't approach contractors without knowing if they can afford it, won't apply for a grant without a loan confirmed. PlanitBER breaks that loop by providing a credible number at the start of the process rather than the end.</w:t>
+        <w:t>The problem it solves</w:t>
       </w:r>
     </w:p>
     <w:p>
       <w:pPr>
-        <w:spacing w:before="80" w:after="40"/>
-        <w:ind w:left="227"/>
+        <w:spacing w:after="120"/>
+      </w:pPr>
+      <w:r>
+        <w:t xml:space="preserve">Ireland has committed to retrofitting </w:t>
+      </w:r>
+      <w:r>
+        <w:rPr>
+          <w:b/>
+          <w:color w:val="1E293B"/>
+        </w:rPr>
+        <w:t>500,000 homes to B2 or better by 2030</w:t>
+      </w:r>
+      <w:r>
+        <w:t>. Current completion rates are well behind target. Three demand-side barriers explain why:</w:t>
+      </w:r>
+    </w:p>
+    <w:p>
+      <w:pPr>
+        <w:spacing w:after="120"/>
       </w:pPr>
       <w:r>
         <w:rPr>
           <w:b/>
-          <w:color w:val="1A2332"/>
-          <w:sz w:val="20"/>
+          <w:color w:val="1E293B"/>
         </w:rPr>
-        <w:t xml:space="preserve">BER assessor visits: </w:t>
-      </w:r>
-      <w:r>
-        <w:rPr>
-          <w:color w:val="475569"/>
-          <w:sz w:val="20"/>
-        </w:rPr>
-        <w:t>Currently the assessor leaves with no budget conversation possible. The homeowner waits weeks for contractor quotes before they can act. With PlanitBER the cost conversation happens at the visit — motivation and information arrive together.</w:t>
+        <w:t>Cost uncertainty stops homeowners acting.</w:t>
       </w:r>
     </w:p>
     <w:p>
       <w:pPr>
-        <w:spacing w:before="80" w:after="40"/>
-        <w:ind w:left="227"/>
+        <w:spacing w:after="120"/>
+      </w:pPr>
+      <w:r>
+        <w:t xml:space="preserve">A BER assessment recommends measures but provides no budget. Homeowners don't know if an upgrade will cost €8,000 or €80,000. Without a credible number they don't apply for grants, don't approach banks, and don't proceed. The conversion from "interested" to "committed" breaks down at the budget question — DEAP answers </w:t>
+      </w:r>
+      <w:r>
+        <w:rPr>
+          <w:i/>
+        </w:rPr>
+        <w:t>how the house performs</w:t>
+      </w:r>
+      <w:r>
+        <w:t xml:space="preserve">; nothing answers </w:t>
+      </w:r>
+      <w:r>
+        <w:rPr>
+          <w:i/>
+        </w:rPr>
+        <w:t>what it costs to fix</w:t>
+      </w:r>
+      <w:r>
+        <w:t>.</w:t>
+      </w:r>
+    </w:p>
+    <w:p>
+      <w:pPr>
+        <w:spacing w:after="120"/>
       </w:pPr>
       <w:r>
         <w:rPr>
           <w:b/>
-          <w:color w:val="1A2332"/>
-          <w:sz w:val="20"/>
+          <w:color w:val="1E293B"/>
         </w:rPr>
-        <w:t xml:space="preserve">One Stop Shop pipeline: </w:t>
-      </w:r>
-      <w:r>
-        <w:rPr>
-          <w:color w:val="475569"/>
-          <w:sz w:val="20"/>
-        </w:rPr>
-        <w:t>If a homeowner arrives with an indicative BOQ already in hand, the OSS can pre-qualify the project and prioritise their survey pipeline more efficiently — reducing time-to-survey for serious applicants.</w:t>
+        <w:t>Grant inflation erodes trust in the scheme.</w:t>
       </w:r>
     </w:p>
     <w:p>
       <w:pPr>
-        <w:spacing w:before="80" w:after="80"/>
-        <w:pBdr>
-          <w:bottom w:val="single" w:sz="6" w:space="1" w:color="E8A020"/>
-        </w:pBdr>
+        <w:spacing w:after="120"/>
       </w:pPr>
+      <w:r>
+        <w:t>A widespread perception — well-founded in some cases — that contractors price to the gross figure and absorb the grant, leaving the homeowner no better off. Homeowners who feel the grant is a contractor bonus rather than a real saving will not participate. Every euro of grant that leaks into margin is a euro of Exchequer spend that bought no retrofit.</w:t>
+      </w:r>
     </w:p>
     <w:p>
       <w:pPr>
-        <w:pStyle w:val="Heading1"/>
-        <w:jc w:val="left"/>
+        <w:spacing w:after="120"/>
       </w:pPr>
       <w:r>
         <w:rPr>
-          <w:color w:val="1A2332"/>
+          <w:b/>
+          <w:color w:val="1E293B"/>
         </w:rPr>
-        <w:t>What It Produces</w:t>
+        <w:t>No bridge between assessment and action.</w:t>
+      </w:r>
+    </w:p>
+    <w:p>
+      <w:pPr>
+        <w:spacing w:after="120"/>
+      </w:pPr>
+      <w:r>
+        <w:t>A BER assessor visits, rates the home, recommends measures, and leaves. The window where a homeowner is most motivated to act closes before they have the one number they need.</w:t>
+      </w:r>
+    </w:p>
+    <w:p>
+      <w:pPr>
+        <w:spacing w:before="200" w:after="60"/>
+      </w:pPr>
+      <w:r>
+        <w:rPr>
+          <w:b/>
+          <w:color w:val="1E293B"/>
+          <w:sz w:val="24"/>
+        </w:rPr>
+        <w:t>How it answers them</w:t>
+      </w:r>
+    </w:p>
+    <w:p>
+      <w:pPr>
+        <w:spacing w:after="120"/>
+      </w:pPr>
+      <w:r>
+        <w:t>PlanitBER generates an itemised, independent cost plan from the assessor's own survey geometry (floor, wall, roof and window areas, age band, heat loss indicator) and a measure selector aligned to SEAI's grant structure:</w:t>
       </w:r>
     </w:p>
     <w:p>
       <w:pPr>
         <w:pStyle w:val="ListBullet"/>
-        <w:spacing w:after="60"/>
       </w:pPr>
       <w:r>
         <w:rPr>
           <w:b/>
-          <w:sz w:val="20"/>
+          <w:color w:val="1E293B"/>
         </w:rPr>
-        <w:t>Itemised BOQ</w:t>
+        <w:t>Cost certainty</w:t>
       </w:r>
       <w:r>
-        <w:rPr>
-          <w:sz w:val="20"/>
-        </w:rPr>
-        <w:t xml:space="preserve"> — material rates, labour (county-adjusted), VAT · SCSI Cost Plan format</w:t>
+        <w:t xml:space="preserve"> — an instant indicative budget, measure by measure, using county-adjusted labour rates and current Irish material pricing, with heat pump sizing from the Heat Loss Indicator (IS EN 12831), fully loaded (O&amp;P 12%, contingency 10%, VAT 13.5%; Solar PV at 0%).</w:t>
       </w:r>
     </w:p>
     <w:p>
       <w:pPr>
         <w:pStyle w:val="ListBullet"/>
-        <w:spacing w:after="60"/>
       </w:pPr>
       <w:r>
         <w:rPr>
           <w:b/>
-          <w:sz w:val="20"/>
+          <w:color w:val="1E293B"/>
         </w:rPr>
-        <w:t>Per-measure SEAI grant breakdown</w:t>
+        <w:t>Grant trust</w:t>
+      </w:r>
+      <w:r>
+        <w:t xml:space="preserve"> — gross costs shown independently of any contractor, SEAI grants deducted line by line, and the document states it plainly: </w:t>
       </w:r>
       <w:r>
         <w:rPr>
-          <w:sz w:val="20"/>
+          <w:i/>
         </w:rPr>
-        <w:t xml:space="preserve"> — Better Energy Homes or One Stop Shop</w:t>
+        <w:t>contractors quote on the gross figures — grants reduce the homeowner's invoice, not justify inflated pricing.</w:t>
+      </w:r>
+      <w:r>
+        <w:t xml:space="preserve"> A homeowner holding an independent benchmark is in a fundamentally stronger negotiating position.</w:t>
       </w:r>
     </w:p>
     <w:p>
       <w:pPr>
         <w:pStyle w:val="ListBullet"/>
-        <w:spacing w:after="60"/>
       </w:pPr>
       <w:r>
         <w:rPr>
           <w:b/>
-          <w:sz w:val="20"/>
+          <w:color w:val="1E293B"/>
         </w:rPr>
-        <w:t>Net cost to homeowner</w:t>
+        <w:t>Assessment to action</w:t>
       </w:r>
       <w:r>
-        <w:rPr>
-          <w:sz w:val="20"/>
-        </w:rPr>
-        <w:t xml:space="preserve"> after grants</w:t>
+        <w:t xml:space="preserve"> — the cost plan is handed over alongside the BER certificate. The gap between recommendation and budget closes to zero.</w:t>
       </w:r>
     </w:p>
     <w:p>
       <w:pPr>
-        <w:pStyle w:val="ListBullet"/>
-        <w:spacing w:after="60"/>
+        <w:spacing w:before="200" w:after="60"/>
       </w:pPr>
       <w:r>
         <w:rPr>
           <w:b/>
-          <w:sz w:val="20"/>
+          <w:color w:val="1E293B"/>
+          <w:sz w:val="24"/>
         </w:rPr>
-        <w:t>Annual energy saving estimate</w:t>
-      </w:r>
-      <w:r>
-        <w:rPr>
-          <w:sz w:val="20"/>
-        </w:rPr>
-        <w:t xml:space="preserve"> and payback years (from BER improvement)</w:t>
+        <w:t>What it produces</w:t>
       </w:r>
     </w:p>
     <w:p>
       <w:pPr>
-        <w:pStyle w:val="ListBullet"/>
-        <w:spacing w:after="60"/>
+        <w:spacing w:after="120"/>
+      </w:pPr>
+      <w:r>
+        <w:t xml:space="preserve">Two documents from one set of inputs, </w:t>
+      </w:r>
+      <w:r>
+        <w:rPr>
+          <w:b/>
+          <w:color w:val="1E293B"/>
+        </w:rPr>
+        <w:t>reconciling to the euro at every level</w:t>
+      </w:r>
+      <w:r>
+        <w:t>:</w:t>
+      </w:r>
+    </w:p>
+    <w:p>
+      <w:pPr>
+        <w:pStyle w:val="ListNumber"/>
       </w:pPr>
       <w:r>
         <w:rPr>
           <w:b/>
-          <w:sz w:val="20"/>
+          <w:color w:val="1E293B"/>
         </w:rPr>
-        <w:t>Green loan monthly repayment guide</w:t>
+        <w:t>Customer Cost Plan (1–2 pages)</w:t>
+      </w:r>
+      <w:r>
+        <w:t xml:space="preserve"> — one row per measure with scope, estimated spend, SEAI grant, and net cost to the homeowner; an actual-spend column for tracking works; a "how to use this document" line for homeowner, lender and contractor. Suitable for bank and grant applications.</w:t>
       </w:r>
     </w:p>
     <w:p>
       <w:pPr>
-        <w:pStyle w:val="ListBullet"/>
-        <w:spacing w:after="60"/>
+        <w:pStyle w:val="ListNumber"/>
       </w:pPr>
       <w:r>
         <w:rPr>
           <w:b/>
-          <w:sz w:val="20"/>
+          <w:color w:val="1E293B"/>
         </w:rPr>
-        <w:t>Contractors needed</w:t>
+        <w:t>Detailed Cost Plan</w:t>
       </w:r>
       <w:r>
-        <w:rPr>
-          <w:sz w:val="20"/>
-        </w:rPr>
-        <w:t xml:space="preserve"> with SEAI registration requirements per trade</w:t>
+        <w:t xml:space="preserve"> — the same table plus the pricing basis per measure, the full loading methodology (base → O&amp;P + contingency → VAT) with a total that ties exactly to the customer headline, and an itemised appendix: every line item with quantity, unit, material rate and labour rate. Any figure a lender or SEAI questions can be traced from the headline down to a unit rate.</w:t>
       </w:r>
     </w:p>
     <w:p>
       <w:pPr>
-        <w:pStyle w:val="ListBullet"/>
-        <w:spacing w:after="60"/>
+        <w:spacing w:after="120"/>
+      </w:pPr>
+      <w:r>
+        <w:t>Plus: per-measure grant breakdown (Better Energy Homes and One Stop Shop, current rates), the SEAI-registered trades required, and estimated-vs-actual cost tracking as works progress.</w:t>
+      </w:r>
+    </w:p>
+    <w:p>
+      <w:pPr>
+        <w:spacing w:before="200" w:after="60"/>
       </w:pPr>
       <w:r>
         <w:rPr>
           <w:b/>
-          <w:sz w:val="20"/>
+          <w:color w:val="1E293B"/>
+          <w:sz w:val="24"/>
         </w:rPr>
-        <w:t>Printable PDF</w:t>
-      </w:r>
-      <w:r>
-        <w:rPr>
-          <w:sz w:val="20"/>
-        </w:rPr>
-        <w:t xml:space="preserve"> suitable for bank and grant applications</w:t>
-      </w:r>
-    </w:p>
-    <w:p>
-      <w:pPr>
-        <w:pStyle w:val="ListBullet"/>
-        <w:spacing w:after="60"/>
-      </w:pPr>
-      <w:r>
-        <w:rPr>
-          <w:b/>
-          <w:sz w:val="20"/>
-        </w:rPr>
-        <w:t>Actual vs. estimated tracker</w:t>
-      </w:r>
-      <w:r>
-        <w:rPr>
-          <w:sz w:val="20"/>
-        </w:rPr>
-        <w:t xml:space="preserve"> — Quoted and Actual columns as works progress</w:t>
-      </w:r>
-    </w:p>
-    <w:p/>
-    <w:p>
-      <w:pPr>
-        <w:pStyle w:val="Heading1"/>
-        <w:jc w:val="left"/>
-      </w:pPr>
-      <w:r>
-        <w:rPr>
-          <w:color w:val="1A2332"/>
-        </w:rPr>
-        <w:t>Who Uses It</w:t>
+        <w:t>Who uses it</w:t>
       </w:r>
     </w:p>
     <w:tbl>
       <w:tblPr>
-        <w:tblStyle w:val="TableGrid"/>
+        <w:tblStyle w:val="LightGrid-Accent1"/>
         <w:tblW w:type="auto" w:w="0"/>
         <w:tblLook w:firstColumn="1" w:firstRow="1" w:lastColumn="0" w:lastRow="0" w:noHBand="0" w:noVBand="1" w:val="04A0"/>
       </w:tblPr>
       <w:tblGrid>
-        <w:gridCol w:w="4703"/>
-        <w:gridCol w:w="4703"/>
+        <w:gridCol w:w="4873"/>
+        <w:gridCol w:w="4873"/>
       </w:tblGrid>
       <w:tr>
         <w:tc>
           <w:tcPr>
-            <w:tcW w:type="dxa" w:w="2551"/>
-            <w:shd w:val="clear" w:color="auto" w:fill="1A2332"/>
+            <w:tcW w:type="dxa" w:w="4873"/>
           </w:tcPr>
           <w:p>
             <w:r>
               <w:rPr>
                 <w:b/>
-                <w:color w:val="FFFFFF"/>
-                <w:sz w:val="18"/>
+                <w:sz w:val="19"/>
               </w:rPr>
               <w:t>User</w:t>
             </w:r>
@@ -596,17 +338,15 @@
         </w:tc>
         <w:tc>
           <w:tcPr>
-            <w:tcW w:type="dxa" w:w="6520"/>
-            <w:shd w:val="clear" w:color="auto" w:fill="1A2332"/>
+            <w:tcW w:type="dxa" w:w="4873"/>
           </w:tcPr>
           <w:p>
             <w:r>
               <w:rPr>
                 <w:b/>
-                <w:color w:val="FFFFFF"/>
-                <w:sz w:val="18"/>
+                <w:sz w:val="19"/>
               </w:rPr>
-              <w:t>How They Use It</w:t>
+              <w:t>How they use it</w:t>
             </w:r>
           </w:p>
         </w:tc>
@@ -614,15 +354,14 @@
       <w:tr>
         <w:tc>
           <w:tcPr>
-            <w:tcW w:type="dxa" w:w="2551"/>
-            <w:shd w:val="clear" w:color="auto" w:fill="F8FAFC"/>
+            <w:tcW w:type="dxa" w:w="4873"/>
           </w:tcPr>
           <w:p>
             <w:r>
               <w:rPr>
                 <w:b/>
-                <w:color w:val="1A2332"/>
-                <w:sz w:val="18"/>
+                <w:color w:val="1E293B"/>
+                <w:sz w:val="19"/>
               </w:rPr>
               <w:t>Homeowners</w:t>
             </w:r>
@@ -630,13 +369,12 @@
         </w:tc>
         <w:tc>
           <w:tcPr>
-            <w:tcW w:type="dxa" w:w="6520"/>
-            <w:shd w:val="clear" w:color="auto" w:fill="F8FAFC"/>
+            <w:tcW w:type="dxa" w:w="4873"/>
           </w:tcPr>
           <w:p>
             <w:r>
               <w:rPr>
-                <w:sz w:val="18"/>
+                <w:sz w:val="19"/>
               </w:rPr>
               <w:t>Understand costs before engaging contractors. Compare quotes against an independent estimate. Track budget during works.</w:t>
             </w:r>
@@ -646,14 +384,14 @@
       <w:tr>
         <w:tc>
           <w:tcPr>
-            <w:tcW w:type="dxa" w:w="2551"/>
+            <w:tcW w:type="dxa" w:w="4873"/>
           </w:tcPr>
           <w:p>
             <w:r>
               <w:rPr>
                 <w:b/>
-                <w:color w:val="1A2332"/>
-                <w:sz w:val="18"/>
+                <w:color w:val="1E293B"/>
+                <w:sz w:val="19"/>
               </w:rPr>
               <w:t>BER Assessors</w:t>
             </w:r>
@@ -661,14 +399,14 @@
         </w:tc>
         <w:tc>
           <w:tcPr>
-            <w:tcW w:type="dxa" w:w="6520"/>
+            <w:tcW w:type="dxa" w:w="4873"/>
           </w:tcPr>
           <w:p>
             <w:r>
               <w:rPr>
-                <w:sz w:val="18"/>
+                <w:sz w:val="19"/>
               </w:rPr>
-              <w:t>Generate instant indicative costs during assessment visits. Turn a certificate into a complete budget conversation at the point of highest motivation.</w:t>
+              <w:t>Turn a certificate into a complete budget conversation during the assessment visit.</w:t>
             </w:r>
           </w:p>
         </w:tc>
@@ -676,15 +414,14 @@
       <w:tr>
         <w:tc>
           <w:tcPr>
-            <w:tcW w:type="dxa" w:w="2551"/>
-            <w:shd w:val="clear" w:color="auto" w:fill="F8FAFC"/>
+            <w:tcW w:type="dxa" w:w="4873"/>
           </w:tcPr>
           <w:p>
             <w:r>
               <w:rPr>
                 <w:b/>
-                <w:color w:val="1A2332"/>
-                <w:sz w:val="18"/>
+                <w:color w:val="1E293B"/>
+                <w:sz w:val="19"/>
               </w:rPr>
               <w:t>Banks &amp; Credit Unions</w:t>
             </w:r>
@@ -692,15 +429,14 @@
         </w:tc>
         <w:tc>
           <w:tcPr>
-            <w:tcW w:type="dxa" w:w="6520"/>
-            <w:shd w:val="clear" w:color="auto" w:fill="F8FAFC"/>
+            <w:tcW w:type="dxa" w:w="4873"/>
           </w:tcPr>
           <w:p>
             <w:r>
               <w:rPr>
-                <w:sz w:val="18"/>
+                <w:sz w:val="19"/>
               </w:rPr>
-              <w:t>Credible cost document for green loan and mortgage applications. Independent of the contractor — breaks the quote loop that delays applications.</w:t>
+              <w:t>A credible, contractor-independent cost document for green loan and mortgage applications.</w:t>
             </w:r>
           </w:p>
         </w:tc>
@@ -708,14 +444,14 @@
       <w:tr>
         <w:tc>
           <w:tcPr>
-            <w:tcW w:type="dxa" w:w="2551"/>
+            <w:tcW w:type="dxa" w:w="4873"/>
           </w:tcPr>
           <w:p>
             <w:r>
               <w:rPr>
                 <w:b/>
-                <w:color w:val="1A2332"/>
-                <w:sz w:val="18"/>
+                <w:color w:val="1E293B"/>
+                <w:sz w:val="19"/>
               </w:rPr>
               <w:t>One Stop Shops</w:t>
             </w:r>
@@ -723,14 +459,14 @@
         </w:tc>
         <w:tc>
           <w:tcPr>
-            <w:tcW w:type="dxa" w:w="6520"/>
+            <w:tcW w:type="dxa" w:w="4873"/>
           </w:tcPr>
           <w:p>
             <w:r>
               <w:rPr>
-                <w:sz w:val="18"/>
+                <w:sz w:val="19"/>
               </w:rPr>
-              <w:t>Quick feasibility cost before committing to a full survey. Pre-qualify projects efficiently and prioritise the survey pipeline.</w:t>
+              <w:t>Fast feasibility costing and project pre-qualification before full survey.</w:t>
             </w:r>
           </w:p>
         </w:tc>
@@ -738,15 +474,14 @@
       <w:tr>
         <w:tc>
           <w:tcPr>
-            <w:tcW w:type="dxa" w:w="2551"/>
-            <w:shd w:val="clear" w:color="auto" w:fill="F8FAFC"/>
+            <w:tcW w:type="dxa" w:w="4873"/>
           </w:tcPr>
           <w:p>
             <w:r>
               <w:rPr>
                 <w:b/>
-                <w:color w:val="1A2332"/>
-                <w:sz w:val="18"/>
+                <w:color w:val="1E293B"/>
+                <w:sz w:val="19"/>
               </w:rPr>
               <w:t>Contractors</w:t>
             </w:r>
@@ -754,15 +489,14 @@
         </w:tc>
         <w:tc>
           <w:tcPr>
-            <w:tcW w:type="dxa" w:w="6520"/>
-            <w:shd w:val="clear" w:color="auto" w:fill="F8FAFC"/>
+            <w:tcW w:type="dxa" w:w="4873"/>
           </w:tcPr>
           <w:p>
             <w:r>
               <w:rPr>
-                <w:sz w:val="18"/>
+                <w:sz w:val="19"/>
               </w:rPr>
-              <w:t>Structured scope-of-works document to quote from. Published rate basis for benchmarking and demonstrating value.</w:t>
+              <w:t>A structured scope-of-works to quote from, with a published rate basis.</w:t>
             </w:r>
           </w:p>
         </w:tc>
@@ -770,14 +504,14 @@
       <w:tr>
         <w:tc>
           <w:tcPr>
-            <w:tcW w:type="dxa" w:w="2551"/>
+            <w:tcW w:type="dxa" w:w="4873"/>
           </w:tcPr>
           <w:p>
             <w:r>
               <w:rPr>
                 <w:b/>
-                <w:color w:val="1A2332"/>
-                <w:sz w:val="18"/>
+                <w:color w:val="1E293B"/>
+                <w:sz w:val="19"/>
               </w:rPr>
               <w:t>Local Authorities &amp; AHBs</w:t>
             </w:r>
@@ -785,14 +519,14 @@
         </w:tc>
         <w:tc>
           <w:tcPr>
-            <w:tcW w:type="dxa" w:w="6520"/>
+            <w:tcW w:type="dxa" w:w="4873"/>
           </w:tcPr>
           <w:p>
             <w:r>
               <w:rPr>
-                <w:sz w:val="18"/>
+                <w:sz w:val="19"/>
               </w:rPr>
-              <w:t>Rapid bulk estimation for estate retrofit programmes. Budget forecasting before tendering.</w:t>
+              <w:t>Rapid bulk estimation and budget forecasting for estate retrofit programmes.</w:t>
             </w:r>
           </w:p>
         </w:tc>
@@ -800,15 +534,14 @@
       <w:tr>
         <w:tc>
           <w:tcPr>
-            <w:tcW w:type="dxa" w:w="2551"/>
-            <w:shd w:val="clear" w:color="auto" w:fill="F8FAFC"/>
+            <w:tcW w:type="dxa" w:w="4873"/>
           </w:tcPr>
           <w:p>
             <w:r>
               <w:rPr>
                 <w:b/>
-                <w:color w:val="1A2332"/>
-                <w:sz w:val="18"/>
+                <w:color w:val="1E293B"/>
+                <w:sz w:val="19"/>
               </w:rPr>
               <w:t>SEAI</w:t>
             </w:r>
@@ -816,15 +549,14 @@
         </w:tc>
         <w:tc>
           <w:tcPr>
-            <w:tcW w:type="dxa" w:w="6520"/>
-            <w:shd w:val="clear" w:color="auto" w:fill="F8FAFC"/>
+            <w:tcW w:type="dxa" w:w="4873"/>
           </w:tcPr>
           <w:p>
             <w:r>
               <w:rPr>
-                <w:sz w:val="18"/>
+                <w:sz w:val="19"/>
               </w:rPr>
-              <w:t>Real-market cost data to calibrate grant rates. Understand project costs across the programme. Supports conversion from assessment to action.</w:t>
+              <w:t>Real-market cost data to calibrate grant rates and monitor programme value for money.</w:t>
             </w:r>
           </w:p>
         </w:tc>
@@ -832,14 +564,14 @@
       <w:tr>
         <w:tc>
           <w:tcPr>
-            <w:tcW w:type="dxa" w:w="2551"/>
+            <w:tcW w:type="dxa" w:w="4873"/>
           </w:tcPr>
           <w:p>
             <w:r>
               <w:rPr>
                 <w:b/>
-                <w:color w:val="1A2332"/>
-                <w:sz w:val="18"/>
+                <w:color w:val="1E293B"/>
+                <w:sz w:val="19"/>
               </w:rPr>
               <w:t>Estate Agents &amp; Solicitors</w:t>
             </w:r>
@@ -847,158 +579,346 @@
         </w:tc>
         <w:tc>
           <w:tcPr>
-            <w:tcW w:type="dxa" w:w="6520"/>
+            <w:tcW w:type="dxa" w:w="4873"/>
           </w:tcPr>
           <w:p>
             <w:r>
               <w:rPr>
-                <w:sz w:val="18"/>
+                <w:sz w:val="19"/>
               </w:rPr>
-              <w:t>Show upgrade costs on property listings. Retrofit cost disclosure in transactions as BER ratings increasingly affect property values.</w:t>
-            </w:r>
-          </w:p>
-        </w:tc>
-      </w:tr>
-      <w:tr>
-        <w:tc>
-          <w:tcPr>
-            <w:tcW w:type="dxa" w:w="2551"/>
-            <w:shd w:val="clear" w:color="auto" w:fill="F8FAFC"/>
-          </w:tcPr>
-          <w:p>
-            <w:r>
-              <w:rPr>
-                <w:b/>
-                <w:color w:val="1A2332"/>
-                <w:sz w:val="18"/>
-              </w:rPr>
-              <w:t>Energy Advisors &amp; Retrofit Coordinators</w:t>
-            </w:r>
-          </w:p>
-        </w:tc>
-        <w:tc>
-          <w:tcPr>
-            <w:tcW w:type="dxa" w:w="6520"/>
-            <w:shd w:val="clear" w:color="auto" w:fill="F8FAFC"/>
-          </w:tcPr>
-          <w:p>
-            <w:r>
-              <w:rPr>
-                <w:sz w:val="18"/>
-              </w:rPr>
-              <w:t>Model different upgrade scenarios and costs. Support client education, project sequencing, and phased works planning.</w:t>
-            </w:r>
-          </w:p>
-        </w:tc>
-      </w:tr>
-      <w:tr>
-        <w:tc>
-          <w:tcPr>
-            <w:tcW w:type="dxa" w:w="2551"/>
-          </w:tcPr>
-          <w:p>
-            <w:r>
-              <w:rPr>
-                <w:b/>
-                <w:color w:val="1A2332"/>
-                <w:sz w:val="18"/>
-              </w:rPr>
-              <w:t>Mortgage Advisors</w:t>
-            </w:r>
-          </w:p>
-        </w:tc>
-        <w:tc>
-          <w:tcPr>
-            <w:tcW w:type="dxa" w:w="6520"/>
-          </w:tcPr>
-          <w:p>
-            <w:r>
-              <w:rPr>
-                <w:sz w:val="18"/>
-              </w:rPr>
-              <w:t>Model the investment case — upgrade cost vs. green mortgage rate saving vs. annual energy saving. Size green top-up loans accurately.</w:t>
+              <w:t>Retrofit cost disclosure on listings and in transactions.</w:t>
             </w:r>
           </w:p>
         </w:tc>
       </w:tr>
     </w:tbl>
-    <w:p/>
     <w:p>
       <w:pPr>
-        <w:spacing w:before="80" w:after="80"/>
-        <w:pBdr>
-          <w:bottom w:val="single" w:sz="6" w:space="1" w:color="E8A020"/>
-        </w:pBdr>
-      </w:pPr>
-    </w:p>
-    <w:p>
-      <w:pPr>
-        <w:pStyle w:val="Heading1"/>
-        <w:jc w:val="left"/>
+        <w:spacing w:before="280" w:after="80"/>
       </w:pPr>
       <w:r>
         <w:rPr>
-          <w:color w:val="1A2332"/>
+          <w:b/>
+          <w:color w:val="B07D1A"/>
+          <w:sz w:val="30"/>
         </w:rPr>
-        <w:t>Why It Is Different</w:t>
+        <w:t>2. The Trial — What It Will Be Used For</w:t>
       </w:r>
     </w:p>
     <w:p>
       <w:pPr>
-        <w:spacing w:after="160"/>
+        <w:spacing w:after="120"/>
       </w:pPr>
       <w:r>
-        <w:rPr>
-          <w:color w:val="475569"/>
-          <w:sz w:val="20"/>
-        </w:rPr>
-        <w:t>This is not a contractor quote. It is not a generic online estimator. It is an independent, geometry-driven cost plan aligned to DEAP measures, SEAI grant structure, and current Irish market rates — produced in the same format a quantity surveyor would use, available instantly, at no cost to the homeowner.</w:t>
+        <w:t>The trial exists to convert PlanitBER's stated accuracy (±15–20%) from a claim into evidence, and to prove the tool fits SEAI's real workflows. Four objectives:</w:t>
       </w:r>
     </w:p>
     <w:p>
       <w:pPr>
-        <w:spacing w:after="80"/>
+        <w:spacing w:after="120"/>
       </w:pPr>
       <w:r>
         <w:rPr>
           <w:b/>
-          <w:color w:val="1A2332"/>
-          <w:sz w:val="18"/>
+          <w:color w:val="1E293B"/>
         </w:rPr>
-        <w:t xml:space="preserve">Data sources: </w:t>
-      </w:r>
-      <w:r>
-        <w:rPr>
-          <w:color w:val="475569"/>
-          <w:sz w:val="18"/>
-        </w:rPr>
-        <w:t>SEO National Wage Agreement 2024  ·  SCSI Regional Cost Supplement Aug 2025  ·  SEAI grant rates effective Feb/Mar 2026  ·  Irish merchant pricing Q1–Q2 2026</w:t>
+        <w:t>Validate accuracy against real prices.</w:t>
       </w:r>
     </w:p>
     <w:p>
       <w:pPr>
-        <w:spacing w:before="80" w:after="80"/>
-        <w:pBdr>
-          <w:bottom w:val="single" w:sz="6" w:space="1" w:color="E8A020"/>
-        </w:pBdr>
+        <w:spacing w:after="120"/>
       </w:pPr>
+      <w:r>
+        <w:t>Run 50–100 live projects through PlanitBER alongside actual contractor quotes and One Stop Shop pricing, across dwelling types (detached, semi-D, terrace, bungalow, apartment), age bands, counties and both grant schemes. Publish the error distribution per measure — not just an average. Where a measure runs hot or cold, the rate book is corrected and the correction is dated and versioned.</w:t>
+      </w:r>
     </w:p>
     <w:p>
       <w:pPr>
-        <w:jc w:val="center"/>
+        <w:spacing w:after="120"/>
+      </w:pPr>
+      <w:r>
+        <w:rPr>
+          <w:b/>
+          <w:color w:val="1E293B"/>
+        </w:rPr>
+        <w:t>Prove the assessor workflow.</w:t>
+      </w:r>
+    </w:p>
+    <w:p>
+      <w:pPr>
+        <w:spacing w:after="120"/>
+      </w:pPr>
+      <w:r>
+        <w:t>Measure the time from completed BER survey to issued cost plan, and whether assessors can produce it during the visit. Success is a cost plan in the homeowner's hand in the same appointment as the certificate.</w:t>
+      </w:r>
+    </w:p>
+    <w:p>
+      <w:pPr>
+        <w:spacing w:after="120"/>
+      </w:pPr>
+      <w:r>
+        <w:rPr>
+          <w:b/>
+          <w:color w:val="1E293B"/>
+        </w:rPr>
+        <w:t>Capture the first actuals dataset.</w:t>
+      </w:r>
+    </w:p>
+    <w:p>
+      <w:pPr>
+        <w:spacing w:after="120"/>
+      </w:pPr>
+      <w:r>
+        <w:t xml:space="preserve">Every trial project's estimated-vs-actual figures, per measure per county, become the seed of a retrofit out-turn cost dataset that currently does not exist anywhere in the programme. Aggregated and anonymised, this is offered back to SEAI as trial output — evidence of what retrofits </w:t>
+      </w:r>
+      <w:r>
+        <w:rPr>
+          <w:i/>
+        </w:rPr>
+        <w:t>actually cost</w:t>
+      </w:r>
+      <w:r>
+        <w:t>, independent of what anyone quoted.</w:t>
+      </w:r>
+    </w:p>
+    <w:p>
+      <w:pPr>
+        <w:spacing w:after="120"/>
+      </w:pPr>
+      <w:r>
+        <w:rPr>
+          <w:b/>
+          <w:color w:val="1E293B"/>
+        </w:rPr>
+        <w:t>Establish rate governance.</w:t>
+      </w:r>
+    </w:p>
+    <w:p>
+      <w:pPr>
+        <w:spacing w:after="120"/>
+      </w:pPr>
+      <w:r>
+        <w:t>The trial period formalises the rate book: named sources (SEO Wage Agreement, SCSI Regional Cost Supplement, merchant pricing), a published review cadence aligned to SEAI's February/March grant revisions, and a versioned change log. SEAI should be able to ask "what did the tool assume on any given date?" and get an exact answer.</w:t>
+      </w:r>
+    </w:p>
+    <w:p>
+      <w:pPr>
+        <w:spacing w:after="120"/>
+      </w:pPr>
+      <w:r>
+        <w:rPr>
+          <w:b/>
+          <w:color w:val="1E293B"/>
+        </w:rPr>
+        <w:t>Trial success criteria, stated up front:</w:t>
+      </w:r>
+      <w:r>
+        <w:t xml:space="preserve"> measured accuracy within the published band for ≥80% of projects; cost plan issued same-day for ≥90% of assessments; a documented rate-correction cycle completed; homeowner conversion (assessment → grant application) tracked against a control group.</w:t>
+      </w:r>
+    </w:p>
+    <w:p>
+      <w:pPr>
+        <w:spacing w:before="280" w:after="80"/>
+      </w:pPr>
+      <w:r>
+        <w:rPr>
+          <w:b/>
+          <w:color w:val="B07D1A"/>
+          <w:sz w:val="30"/>
+        </w:rPr>
+        <w:t>3. What It Can Become</w:t>
+      </w:r>
+    </w:p>
+    <w:p>
+      <w:pPr>
+        <w:spacing w:after="120"/>
+      </w:pPr>
+      <w:r>
+        <w:rPr>
+          <w:b/>
+          <w:color w:val="1E293B"/>
+        </w:rPr>
+        <w:t>The default next step after every BER.</w:t>
+      </w:r>
+    </w:p>
+    <w:p>
+      <w:pPr>
+        <w:spacing w:after="120"/>
+      </w:pPr>
+      <w:r>
+        <w:t xml:space="preserve">Ireland publishes roughly 100,000 BERs a year. Behind each certificate is a DEAP file already containing the geometry PlanitBER needs — floor, wall, roof and window areas, age band, heat loss data. With SEAI's cooperation on the BER file format, the workflow becomes: </w:t>
+      </w:r>
+      <w:r>
+        <w:rPr>
+          <w:i/>
+        </w:rPr>
+        <w:t>upload the BER export → costed, grant-netted plan in sixty seconds.</w:t>
+      </w:r>
+      <w:r>
+        <w:t xml:space="preserve"> No re-surveying, no transcription errors, no friction. This is the "add-on to DEAP" in practical form: DEAP tells the homeowner where the house is; PlanitBER tells them what the journey costs.</w:t>
+      </w:r>
+    </w:p>
+    <w:p>
+      <w:pPr>
+        <w:spacing w:after="120"/>
+      </w:pPr>
+      <w:r>
+        <w:rPr>
+          <w:b/>
+          <w:color w:val="1E293B"/>
+        </w:rPr>
+        <w:t>A national retrofit cost index.</w:t>
+      </w:r>
+    </w:p>
+    <w:p>
+      <w:pPr>
+        <w:spacing w:after="120"/>
+      </w:pPr>
+      <w:r>
+        <w:t>At scale, the estimated-vs-actual dataset becomes a live index of retrofit costs per measure, per dwelling type, per county — the reference SEAI needs to calibrate grant rates annually, detect regional price anomalies, and demonstrate value for money to the Exchequer. Nobody holds this data today. The tool that produces the estimates is the natural instrument to collect the outcomes.</w:t>
+      </w:r>
+    </w:p>
+    <w:p>
+      <w:pPr>
+        <w:spacing w:after="120"/>
+      </w:pPr>
+      <w:r>
+        <w:rPr>
+          <w:b/>
+          <w:color w:val="1E293B"/>
+        </w:rPr>
+        <w:t>A compliance-aware eligibility engine.</w:t>
+      </w:r>
+    </w:p>
+    <w:p>
+      <w:pPr>
+        <w:spacing w:after="120"/>
+      </w:pPr>
+      <w:r>
+        <w:t>The next build step is encoding SEAI's eligibility gates directly into the tool — year-built rules for insulation and heat pump grants, the post-works HLI ≤ 2.3 W/m²K technical assessment threshold, measure-combination rules — so a plan that prices a grant is a plan that qualifies for it. Assessors stop making eligibility mistakes; SEAI stops processing applications that were never eligible.</w:t>
+      </w:r>
+    </w:p>
+    <w:p>
+      <w:pPr>
+        <w:spacing w:after="120"/>
+      </w:pPr>
+      <w:r>
+        <w:rPr>
+          <w:b/>
+          <w:color w:val="1E293B"/>
+        </w:rPr>
+        <w:t>The standard document for retrofit finance.</w:t>
+      </w:r>
+    </w:p>
+    <w:p>
+      <w:pPr>
+        <w:spacing w:after="120"/>
+      </w:pPr>
+      <w:r>
+        <w:t>Banks and credit unions writing green loans need a consistent, contractor-independent cost basis. A recognised PlanitBER cost plan — one format, reconcilable, grant-aware — is the missing standard attachment for the Home Energy Upgrade Loan Scheme.</w:t>
+      </w:r>
+    </w:p>
+    <w:p>
+      <w:pPr>
+        <w:spacing w:after="120"/>
+      </w:pPr>
+      <w:r>
+        <w:rPr>
+          <w:b/>
+          <w:color w:val="1E293B"/>
+        </w:rPr>
+        <w:t>Whole-project coverage.</w:t>
+      </w:r>
+    </w:p>
+    <w:p>
+      <w:pPr>
+        <w:spacing w:after="120"/>
+      </w:pPr>
+      <w:r>
+        <w:t>The same engine and report format already extend to refurbishment-plus-extension and new build, so deep retrofits that grow into bigger projects stay inside one consistent costing framework.</w:t>
+      </w:r>
+    </w:p>
+    <w:p>
+      <w:pPr>
+        <w:spacing w:before="200" w:after="60"/>
+      </w:pPr>
+      <w:r>
+        <w:rPr>
+          <w:b/>
+          <w:color w:val="1E293B"/>
+          <w:sz w:val="24"/>
+        </w:rPr>
+        <w:t>The partnership path</w:t>
+      </w:r>
+    </w:p>
+    <w:p>
+      <w:pPr>
+        <w:pStyle w:val="ListNumber"/>
+      </w:pPr>
+      <w:r>
+        <w:rPr>
+          <w:b/>
+          <w:color w:val="1E293B"/>
+        </w:rPr>
+        <w:t>Pilot</w:t>
+      </w:r>
+      <w:r>
+        <w:t xml:space="preserve"> — the trial above: accuracy report, actuals dataset, rate governance, delivered to SEAI.</w:t>
+      </w:r>
+    </w:p>
+    <w:p>
+      <w:pPr>
+        <w:pStyle w:val="ListNumber"/>
+      </w:pPr>
+      <w:r>
+        <w:rPr>
+          <w:b/>
+          <w:color w:val="1E293B"/>
+        </w:rPr>
+        <w:t>Recognition</w:t>
+      </w:r>
+      <w:r>
+        <w:t xml:space="preserve"> — PlanitBER as a recognised indicative costing tool for assessors and One Stop Shops, with the rate-book maintenance commitment.</w:t>
+      </w:r>
+    </w:p>
+    <w:p>
+      <w:pPr>
+        <w:pStyle w:val="ListNumber"/>
+      </w:pPr>
+      <w:r>
+        <w:rPr>
+          <w:b/>
+          <w:color w:val="1E293B"/>
+        </w:rPr>
+        <w:t>Integration</w:t>
+      </w:r>
+      <w:r>
+        <w:t xml:space="preserve"> — BER file handshake, making the costed plan the default second page of every assessment in the country.</w:t>
+      </w:r>
+    </w:p>
+    <w:p>
+      <w:pPr>
+        <w:spacing w:after="120"/>
+      </w:pPr>
+      <w:r>
+        <w:t>Each step gives SEAI something concrete — evidence, data, homeowner conversion — before asking for the next.</w:t>
+      </w:r>
+    </w:p>
+    <w:p>
+      <w:pPr>
+        <w:spacing w:after="120"/>
       </w:pPr>
       <w:r>
         <w:rPr>
           <w:i/>
-          <w:color w:val="94A3B8"/>
-          <w:sz w:val="16"/>
         </w:rPr>
-        <w:t>PlanitBER V1  ·  Turley Energy Consultants  ·  Indicative accuracy ±15–20%  ·  Not a substitute for a formal QS report</w:t>
+        <w:t>PlanitBER V1 · Turley Energy Consultants · Indicative accuracy ±15–20% (to be evidenced in trial) · Independent estimate — not prepared by any contractor · Not a substitute for a formal QS report</w:t>
       </w:r>
     </w:p>
     <w:sectPr>
       <w:pgSz w:w="12240" w:h="15840"/>
-      <w:pgMar w:top="1134" w:right="1417" w:bottom="1134" w:left="1417" w:header="720" w:footer="720" w:gutter="0"/>
+      <w:pgMar w:top="1134" w:right="1247" w:bottom="1134" w:left="1247" w:header="720" w:footer="720" w:gutter="0"/>
       <w:cols w:space="720"/>
       <w:docGrid w:linePitch="360"/>
     </w:sectPr>
@@ -1369,6 +1289,11 @@
     <w:name w:val="Normal"/>
     <w:qFormat/>
     <w:rsid w:val="00FC693F"/>
+    <w:rPr>
+      <w:rFonts w:ascii="Calibri" w:hAnsi="Calibri"/>
+      <w:color w:val="475569"/>
+      <w:sz w:val="21"/>
+    </w:rPr>
   </w:style>
   <w:style w:type="paragraph" w:styleId="Header">
     <w:name w:val="header"/>

</xml_diff>

<commit_message>
Value proposition: anchor the pitch on the BER Advisory Report
The Advisory Report is the SEAI-mandated document that recommends
measures for a specific home and carries no costs — it is precisely
the artefact PlanitBER completes. Naming it makes the problem
statement concrete and the integration ask specific:

- Opening line reframed: PlanitBER prices what the Advisory Report
  recommends
- Problem 1 and 3 name the Advisory Report as the document the
  homeowner is handed with no way to act on it
- Part 3 integration: Advisory Report + DEAP geometry together are a
  complete PlanitBER input, with a three-document table (Certificate
  / Advisory Report / Cost Plan) showing where the gap sits
- Partnership path step 3 and the closing ask now reference the file
  and Advisory Report handshake for consenting homeowners

Co-Authored-By: Claude Opus 5 <noreply@anthropic.com>
Claude-Session: https://claude.ai/code/session_017c6VtAdYwGJhpVqbEFh3tW
</commit_message>
<xml_diff>
--- a/PlanitBER_Value_Proposition.docx
+++ b/PlanitBER_Value_Proposition.docx
@@ -29,7 +29,25 @@
         <w:spacing w:after="120"/>
       </w:pPr>
       <w:r>
-        <w:t>PlanitBER turns a BER assessment into an independent, grant-netted, finance-ready budget in under two minutes — the same data the assessor already holds, priced in the format a quantity surveyor would use.</w:t>
+        <w:t xml:space="preserve">Every BER assessment already tells a homeowner </w:t>
+      </w:r>
+      <w:r>
+        <w:rPr>
+          <w:i/>
+        </w:rPr>
+        <w:t>what to do</w:t>
+      </w:r>
+      <w:r>
+        <w:t xml:space="preserve"> — the Advisory Report lists the recommended upgrade measures. None of them says </w:t>
+      </w:r>
+      <w:r>
+        <w:rPr>
+          <w:i/>
+        </w:rPr>
+        <w:t>what it costs</w:t>
+      </w:r>
+      <w:r>
+        <w:t>. PlanitBER prices that recommendation: an independent, grant-netted, finance-ready budget in under two minutes, from the same data the assessor already holds, in the format a quantity surveyor would use.</w:t>
       </w:r>
     </w:p>
     <w:p>
@@ -93,7 +111,17 @@
         <w:spacing w:after="120"/>
       </w:pPr>
       <w:r>
-        <w:t xml:space="preserve">A BER assessment recommends measures but provides no budget. Homeowners don't know if an upgrade will cost €8,000 or €80,000. Without a credible number they don't apply for grants, don't approach banks, and don't proceed. The conversion from "interested" to "committed" breaks down at the budget question — DEAP answers </w:t>
+        <w:t xml:space="preserve">Every BER assessment issues a </w:t>
+      </w:r>
+      <w:r>
+        <w:rPr>
+          <w:b/>
+          <w:color w:val="1E293B"/>
+        </w:rPr>
+        <w:t>BER Advisory Report</w:t>
+      </w:r>
+      <w:r>
+        <w:t xml:space="preserve"> setting out the recommended upgrade measures for that specific home. It is the single most actionable document a homeowner receives — and it carries no costs. Homeowners don't know if the recommendation in front of them means €8,000 or €80,000. Without a credible number they don't apply for grants, don't approach banks, and don't proceed. The conversion from "interested" to "committed" breaks down at the budget question — DEAP answers </w:t>
       </w:r>
       <w:r>
         <w:rPr>
@@ -102,13 +130,22 @@
         <w:t>how the house performs</w:t>
       </w:r>
       <w:r>
+        <w:t xml:space="preserve">, the Advisory Report answers </w:t>
+      </w:r>
+      <w:r>
+        <w:rPr>
+          <w:i/>
+        </w:rPr>
+        <w:t>what to do about it</w:t>
+      </w:r>
+      <w:r>
         <w:t xml:space="preserve">; nothing answers </w:t>
       </w:r>
       <w:r>
         <w:rPr>
           <w:i/>
         </w:rPr>
-        <w:t>what it costs to fix</w:t>
+        <w:t>what it costs</w:t>
       </w:r>
       <w:r>
         <w:t>.</w:t>
@@ -151,7 +188,7 @@
         <w:spacing w:after="120"/>
       </w:pPr>
       <w:r>
-        <w:t>A BER assessor visits, rates the home, recommends measures, and leaves. The window where a homeowner is most motivated to act closes before they have the one number they need.</w:t>
+        <w:t>A BER assessor visits, rates the home, issues the certificate and Advisory Report, and leaves. The homeowner is handed a list of recommended measures and no way to act on it. The window where they are most motivated closes before they have the one number they need.</w:t>
       </w:r>
     </w:p>
     <w:p>
@@ -172,7 +209,7 @@
         <w:spacing w:after="120"/>
       </w:pPr>
       <w:r>
-        <w:t>PlanitBER generates an itemised, independent cost plan from the assessor's own survey geometry (floor, wall, roof and window areas, age band, heat loss indicator) and a measure selector aligned to SEAI's grant structure:</w:t>
+        <w:t>PlanitBER generates an itemised, independent cost plan from the assessor's own survey geometry (floor, wall, roof and window areas, age band, heat loss indicator) and a measure selector built around the same measures an Advisory Report recommends and SEAI grant-aids:</w:t>
       </w:r>
     </w:p>
     <w:p>
@@ -226,7 +263,7 @@
         <w:t>Assessment to action</w:t>
       </w:r>
       <w:r>
-        <w:t xml:space="preserve"> — the cost plan is handed over alongside the BER certificate. The gap between recommendation and budget closes to zero.</w:t>
+        <w:t xml:space="preserve"> — the cost plan is handed over alongside the BER certificate and Advisory Report, as the page that prices what the Advisory Report recommends. The gap between recommendation and budget closes to zero.</w:t>
       </w:r>
     </w:p>
     <w:p>
@@ -739,7 +776,7 @@
           <w:b/>
           <w:color w:val="1E293B"/>
         </w:rPr>
-        <w:t>The default next step after every BER.</w:t>
+        <w:t>The costed Advisory Report — the default next step after every BER.</w:t>
       </w:r>
     </w:p>
     <w:p>
@@ -747,16 +784,227 @@
         <w:spacing w:after="120"/>
       </w:pPr>
       <w:r>
-        <w:t xml:space="preserve">Ireland publishes roughly 100,000 BERs a year. Behind each certificate is a DEAP file already containing the geometry PlanitBER needs — floor, wall, roof and window areas, age band, heat loss data. With SEAI's cooperation on the BER file format, the workflow becomes: </w:t>
+        <w:t xml:space="preserve">Ireland publishes roughly 100,000 BERs a year, and every one produces two things PlanitBER needs: a DEAP file holding the geometry (floor, wall, roof and window areas, age band, heat loss data) and an </w:t>
+      </w:r>
+      <w:r>
+        <w:rPr>
+          <w:b/>
+          <w:color w:val="1E293B"/>
+        </w:rPr>
+        <w:t>Advisory Report holding the recommended measures</w:t>
+      </w:r>
+      <w:r>
+        <w:t>. Between them they are a complete PlanitBER input — the survey has already been done, by a registered assessor, under SEAI's own quality regime.</w:t>
+      </w:r>
+    </w:p>
+    <w:p>
+      <w:pPr>
+        <w:spacing w:after="120"/>
+      </w:pPr>
+      <w:r>
+        <w:t xml:space="preserve">With SEAI's cooperation on the file format, the workflow becomes: </w:t>
       </w:r>
       <w:r>
         <w:rPr>
           <w:i/>
         </w:rPr>
-        <w:t>upload the BER export → costed, grant-netted plan in sixty seconds.</w:t>
+        <w:t>upload the BER export and Advisory Report → costed, grant-netted plan in sixty seconds.</w:t>
       </w:r>
       <w:r>
-        <w:t xml:space="preserve"> No re-surveying, no transcription errors, no friction. This is the "add-on to DEAP" in practical form: DEAP tells the homeowner where the house is; PlanitBER tells them what the journey costs.</w:t>
+        <w:t xml:space="preserve"> No re-surveying, no re-keying, no transcription error. This is the "add-on to DEAP" in its practical form, and it completes a natural set of three documents:</w:t>
+      </w:r>
+    </w:p>
+    <w:tbl>
+      <w:tblPr>
+        <w:tblStyle w:val="LightGrid-Accent1"/>
+        <w:tblW w:type="auto" w:w="0"/>
+        <w:tblLook w:firstColumn="1" w:firstRow="1" w:lastColumn="0" w:lastRow="0" w:noHBand="0" w:noVBand="1" w:val="04A0"/>
+      </w:tblPr>
+      <w:tblGrid>
+        <w:gridCol w:w="3249"/>
+        <w:gridCol w:w="3249"/>
+        <w:gridCol w:w="3249"/>
+      </w:tblGrid>
+      <w:tr>
+        <w:tc>
+          <w:tcPr>
+            <w:tcW w:type="dxa" w:w="3249"/>
+          </w:tcPr>
+          <w:p>
+            <w:r>
+              <w:rPr>
+                <w:b/>
+                <w:sz w:val="19"/>
+              </w:rPr>
+              <w:t>Document</w:t>
+            </w:r>
+          </w:p>
+        </w:tc>
+        <w:tc>
+          <w:tcPr>
+            <w:tcW w:type="dxa" w:w="3249"/>
+          </w:tcPr>
+          <w:p>
+            <w:r>
+              <w:rPr>
+                <w:b/>
+                <w:sz w:val="19"/>
+              </w:rPr>
+              <w:t>Answers</w:t>
+            </w:r>
+          </w:p>
+        </w:tc>
+        <w:tc>
+          <w:tcPr>
+            <w:tcW w:type="dxa" w:w="3249"/>
+          </w:tcPr>
+          <w:p>
+            <w:r>
+              <w:rPr>
+                <w:b/>
+                <w:sz w:val="19"/>
+              </w:rPr>
+              <w:t>Issued by</w:t>
+            </w:r>
+          </w:p>
+        </w:tc>
+      </w:tr>
+      <w:tr>
+        <w:tc>
+          <w:tcPr>
+            <w:tcW w:type="dxa" w:w="3249"/>
+          </w:tcPr>
+          <w:p>
+            <w:r>
+              <w:rPr>
+                <w:sz w:val="19"/>
+              </w:rPr>
+              <w:t>BER Certificate</w:t>
+            </w:r>
+          </w:p>
+        </w:tc>
+        <w:tc>
+          <w:tcPr>
+            <w:tcW w:type="dxa" w:w="3249"/>
+          </w:tcPr>
+          <w:p>
+            <w:r>
+              <w:rPr>
+                <w:sz w:val="19"/>
+              </w:rPr>
+              <w:t>How does this home perform?</w:t>
+            </w:r>
+          </w:p>
+        </w:tc>
+        <w:tc>
+          <w:tcPr>
+            <w:tcW w:type="dxa" w:w="3249"/>
+          </w:tcPr>
+          <w:p>
+            <w:r>
+              <w:rPr>
+                <w:sz w:val="19"/>
+              </w:rPr>
+              <w:t>SEAI / assessor</w:t>
+            </w:r>
+          </w:p>
+        </w:tc>
+      </w:tr>
+      <w:tr>
+        <w:tc>
+          <w:tcPr>
+            <w:tcW w:type="dxa" w:w="3249"/>
+          </w:tcPr>
+          <w:p>
+            <w:r>
+              <w:rPr>
+                <w:sz w:val="19"/>
+              </w:rPr>
+              <w:t>BER Advisory Report</w:t>
+            </w:r>
+          </w:p>
+        </w:tc>
+        <w:tc>
+          <w:tcPr>
+            <w:tcW w:type="dxa" w:w="3249"/>
+          </w:tcPr>
+          <w:p>
+            <w:r>
+              <w:rPr>
+                <w:sz w:val="19"/>
+              </w:rPr>
+              <w:t>What should be done about it?</w:t>
+            </w:r>
+          </w:p>
+        </w:tc>
+        <w:tc>
+          <w:tcPr>
+            <w:tcW w:type="dxa" w:w="3249"/>
+          </w:tcPr>
+          <w:p>
+            <w:r>
+              <w:rPr>
+                <w:sz w:val="19"/>
+              </w:rPr>
+              <w:t>SEAI / assessor</w:t>
+            </w:r>
+          </w:p>
+        </w:tc>
+      </w:tr>
+      <w:tr>
+        <w:tc>
+          <w:tcPr>
+            <w:tcW w:type="dxa" w:w="3249"/>
+          </w:tcPr>
+          <w:p>
+            <w:r>
+              <w:rPr>
+                <w:b/>
+                <w:color w:val="1E293B"/>
+                <w:sz w:val="19"/>
+              </w:rPr>
+              <w:t>PlanitBER Cost Plan</w:t>
+            </w:r>
+          </w:p>
+        </w:tc>
+        <w:tc>
+          <w:tcPr>
+            <w:tcW w:type="dxa" w:w="3249"/>
+          </w:tcPr>
+          <w:p>
+            <w:r>
+              <w:rPr>
+                <w:b/>
+                <w:color w:val="1E293B"/>
+                <w:sz w:val="19"/>
+              </w:rPr>
+              <w:t>What will that cost, net of grants?</w:t>
+            </w:r>
+          </w:p>
+        </w:tc>
+        <w:tc>
+          <w:tcPr>
+            <w:tcW w:type="dxa" w:w="3249"/>
+          </w:tcPr>
+          <w:p>
+            <w:r>
+              <w:rPr>
+                <w:b/>
+                <w:color w:val="1E293B"/>
+                <w:sz w:val="19"/>
+              </w:rPr>
+              <w:t>PlanitBER</w:t>
+            </w:r>
+          </w:p>
+        </w:tc>
+      </w:tr>
+    </w:tbl>
+    <w:p>
+      <w:pPr>
+        <w:spacing w:after="120"/>
+      </w:pPr>
+      <w:r>
+        <w:t>The first two are mandatory and already national. The third is the one the homeowner cannot get today.</w:t>
       </w:r>
     </w:p>
     <w:p>
@@ -894,7 +1142,7 @@
         <w:t>Integration</w:t>
       </w:r>
       <w:r>
-        <w:t xml:space="preserve"> — BER file handshake, making the costed plan the default second page of every assessment in the country.</w:t>
+        <w:t xml:space="preserve"> — the BER file and Advisory Report handshake, making the costed plan the standard companion to every Advisory Report issued in the country.</w:t>
       </w:r>
     </w:p>
     <w:p>
@@ -902,7 +1150,7 @@
         <w:spacing w:after="120"/>
       </w:pPr>
       <w:r>
-        <w:t>Each step gives SEAI something concrete — evidence, data, homeowner conversion — before asking for the next.</w:t>
+        <w:t>Each step gives SEAI something concrete — evidence, data, homeowner conversion — before asking for the next. The only thing PlanitBER asks of SEAI is access to the file formats for consenting homeowners; everything else is built and maintained on our side.</w:t>
       </w:r>
     </w:p>
     <w:p>

</xml_diff>

<commit_message>
Value proposition: reposition as independent tool seeking SEAI endorsement
- The ask is stated up front: SEAI recognition and promotion, not
  integration. Explicit that PlanitBER is standalone, needs no change
  to DEAP and no development effort on SEAI's side
- Removed the DEAP add-on framing and the BER-document pairing table
- Advisory Report references removed; 'advisory' now refers to the
  assessor's improvement-advice role, which PlanitBER extends from
  what to do to what it costs
- Grant applications reframed as a longer-term possibility rather
  than a near-term proposal
- Partnership path: trial -> recognition and promotion -> wider role,
  closing on SEAI's role being endorsement, not build or spend
- Problem statements, benefits table and trial objectives retained

Co-Authored-By: Claude Opus 5 <noreply@anthropic.com>
Claude-Session: https://claude.ai/code/session_017c6VtAdYwGJhpVqbEFh3tW
</commit_message>
<xml_diff>
--- a/PlanitBER_Value_Proposition.docx
+++ b/PlanitBER_Value_Proposition.docx
@@ -21,7 +21,7 @@
           <w:b/>
           <w:color w:val="1E293B"/>
         </w:rPr>
-        <w:t>The cost layer Ireland's retrofit programme is missing.</w:t>
+        <w:t>Independent, instant retrofit costing for Irish homes.</w:t>
       </w:r>
     </w:p>
     <w:p>
@@ -29,25 +29,22 @@
         <w:spacing w:after="120"/>
       </w:pPr>
       <w:r>
-        <w:t xml:space="preserve">Every BER assessment already tells a homeowner </w:t>
+        <w:t>PlanitBER turns a completed home survey into a clear, grant-netted, finance-ready budget in under two minutes — itemised in the format a quantity surveyor would use, and independent of any contractor.</w:t>
+      </w:r>
+    </w:p>
+    <w:p>
+      <w:pPr>
+        <w:spacing w:after="120"/>
+      </w:pPr>
+      <w:r>
+        <w:rPr>
+          <w:b/>
+          <w:color w:val="1E293B"/>
+        </w:rPr>
+        <w:t>What we are asking of SEAI:</w:t>
       </w:r>
       <w:r>
-        <w:rPr>
-          <w:i/>
-        </w:rPr>
-        <w:t>what to do</w:t>
-      </w:r>
-      <w:r>
-        <w:t xml:space="preserve"> — the Advisory Report lists the recommended upgrade measures. None of them says </w:t>
-      </w:r>
-      <w:r>
-        <w:rPr>
-          <w:i/>
-        </w:rPr>
-        <w:t>what it costs</w:t>
-      </w:r>
-      <w:r>
-        <w:t>. PlanitBER prices that recommendation: an independent, grant-netted, finance-ready budget in under two minutes, from the same data the assessor already holds, in the format a quantity surveyor would use.</w:t>
+        <w:t xml:space="preserve"> recognition and promotion of PlanitBER as an approved indicative costing tool for BER assessors, One Stop Shops and homeowners. PlanitBER is standalone software. It requires no integration with SEAI systems, no change to DEAP, and no development effort on SEAI's side.</w:t>
       </w:r>
     </w:p>
     <w:p>
@@ -111,44 +108,7 @@
         <w:spacing w:after="120"/>
       </w:pPr>
       <w:r>
-        <w:t xml:space="preserve">Every BER assessment issues a </w:t>
-      </w:r>
-      <w:r>
-        <w:rPr>
-          <w:b/>
-          <w:color w:val="1E293B"/>
-        </w:rPr>
-        <w:t>BER Advisory Report</w:t>
-      </w:r>
-      <w:r>
-        <w:t xml:space="preserve"> setting out the recommended upgrade measures for that specific home. It is the single most actionable document a homeowner receives — and it carries no costs. Homeowners don't know if the recommendation in front of them means €8,000 or €80,000. Without a credible number they don't apply for grants, don't approach banks, and don't proceed. The conversion from "interested" to "committed" breaks down at the budget question — DEAP answers </w:t>
-      </w:r>
-      <w:r>
-        <w:rPr>
-          <w:i/>
-        </w:rPr>
-        <w:t>how the house performs</w:t>
-      </w:r>
-      <w:r>
-        <w:t xml:space="preserve">, the Advisory Report answers </w:t>
-      </w:r>
-      <w:r>
-        <w:rPr>
-          <w:i/>
-        </w:rPr>
-        <w:t>what to do about it</w:t>
-      </w:r>
-      <w:r>
-        <w:t xml:space="preserve">; nothing answers </w:t>
-      </w:r>
-      <w:r>
-        <w:rPr>
-          <w:i/>
-        </w:rPr>
-        <w:t>what it costs</w:t>
-      </w:r>
-      <w:r>
-        <w:t>.</w:t>
+        <w:t>A home energy assessment identifies what needs upgrading, but puts no price on it. Homeowners don't know whether the work in front of them means €8,000 or €80,000. Without a credible number they don't apply for grants, don't approach their bank, and don't proceed. The conversion from "interested" to "committed" breaks down at the budget question, and there is currently no trusted, independent answer to it.</w:t>
       </w:r>
     </w:p>
     <w:p>
@@ -168,7 +128,7 @@
         <w:spacing w:after="120"/>
       </w:pPr>
       <w:r>
-        <w:t>A widespread perception — well-founded in some cases — that contractors price to the gross figure and absorb the grant, leaving the homeowner no better off. Homeowners who feel the grant is a contractor bonus rather than a real saving will not participate. Every euro of grant that leaks into margin is a euro of Exchequer spend that bought no retrofit.</w:t>
+        <w:t>A widespread perception — well-founded in some cases — that contractors price to the gross figure and absorb the grant, leaving the homeowner no better off. Homeowners who believe the grant is a contractor bonus rather than a real saving will not participate. Every euro of grant that leaks into margin is a euro of Exchequer spend that bought no retrofit.</w:t>
       </w:r>
     </w:p>
     <w:p>
@@ -188,7 +148,7 @@
         <w:spacing w:after="120"/>
       </w:pPr>
       <w:r>
-        <w:t>A BER assessor visits, rates the home, issues the certificate and Advisory Report, and leaves. The homeowner is handed a list of recommended measures and no way to act on it. The window where they are most motivated closes before they have the one number they need.</w:t>
+        <w:t>An assessor visits, surveys the home, and advises on the improvements that would raise its rating. The homeowner is left with a list of recommendations and no way to act on them. The window in which they are most motivated closes before they have the one number they need.</w:t>
       </w:r>
     </w:p>
     <w:p>
@@ -209,7 +169,7 @@
         <w:spacing w:after="120"/>
       </w:pPr>
       <w:r>
-        <w:t>PlanitBER generates an itemised, independent cost plan from the assessor's own survey geometry (floor, wall, roof and window areas, age band, heat loss indicator) and a measure selector built around the same measures an Advisory Report recommends and SEAI grant-aids:</w:t>
+        <w:t>PlanitBER builds an itemised, independent cost plan from survey geometry the assessor has already measured — floor, wall, roof and window areas, age band and heat loss indicator — against a measure list that mirrors SEAI's grant structure:</w:t>
       </w:r>
     </w:p>
     <w:p>
@@ -221,10 +181,10 @@
           <w:b/>
           <w:color w:val="1E293B"/>
         </w:rPr>
-        <w:t>Cost certainty</w:t>
+        <w:t>Cost certainty.</w:t>
       </w:r>
       <w:r>
-        <w:t xml:space="preserve"> — an instant indicative budget, measure by measure, using county-adjusted labour rates and current Irish material pricing, with heat pump sizing from the Heat Loss Indicator (IS EN 12831), fully loaded (O&amp;P 12%, contingency 10%, VAT 13.5%; Solar PV at 0%).</w:t>
+        <w:t xml:space="preserve"> An instant indicative budget, measure by measure, using county-adjusted labour rates and current Irish material pricing, with heat pump sizing derived from the Heat Loss Indicator (IS EN 12831). Every figure is fully loaded: contractor's overhead and profit at 12%, contingency at 10%, VAT at 13.5% (Solar PV at 0% per Revenue ruling).</w:t>
       </w:r>
     </w:p>
     <w:p>
@@ -236,19 +196,19 @@
           <w:b/>
           <w:color w:val="1E293B"/>
         </w:rPr>
-        <w:t>Grant trust</w:t>
+        <w:t>Grant transparency.</w:t>
       </w:r>
       <w:r>
-        <w:t xml:space="preserve"> — gross costs shown independently of any contractor, SEAI grants deducted line by line, and the document states it plainly: </w:t>
+        <w:t xml:space="preserve"> Gross costs are shown independently of any contractor, with SEAI grants deducted line by line and the net cost to the homeowner stated plainly. The document itself carries the message: </w:t>
       </w:r>
       <w:r>
         <w:rPr>
           <w:i/>
         </w:rPr>
-        <w:t>contractors quote on the gross figures — grants reduce the homeowner's invoice, not justify inflated pricing.</w:t>
+        <w:t>contractors quote on the gross figures — grants reduce the homeowner's invoice, they do not justify inflated pricing.</w:t>
       </w:r>
       <w:r>
-        <w:t xml:space="preserve"> A homeowner holding an independent benchmark is in a fundamentally stronger negotiating position.</w:t>
+        <w:t xml:space="preserve"> A homeowner holding an independent benchmark is in a fundamentally stronger position.</w:t>
       </w:r>
     </w:p>
     <w:p>
@@ -260,10 +220,10 @@
           <w:b/>
           <w:color w:val="1E293B"/>
         </w:rPr>
-        <w:t>Assessment to action</w:t>
+        <w:t>Assessment to action.</w:t>
       </w:r>
       <w:r>
-        <w:t xml:space="preserve"> — the cost plan is handed over alongside the BER certificate and Advisory Report, as the page that prices what the Advisory Report recommends. The gap between recommendation and budget closes to zero.</w:t>
+        <w:t xml:space="preserve"> The assessor can produce the cost plan during the same visit and hand it over with the certificate, as the practical companion to the improvement advice they already give. The gap between recommendation and budget closes to zero.</w:t>
       </w:r>
     </w:p>
     <w:p>
@@ -309,7 +269,7 @@
         <w:t>Customer Cost Plan (1–2 pages)</w:t>
       </w:r>
       <w:r>
-        <w:t xml:space="preserve"> — one row per measure with scope, estimated spend, SEAI grant, and net cost to the homeowner; an actual-spend column for tracking works; a "how to use this document" line for homeowner, lender and contractor. Suitable for bank and grant applications.</w:t>
+        <w:t xml:space="preserve"> — one row per measure showing scope, estimated spend, SEAI grant and net cost to the homeowner, plus an actual-spend column for tracking works as they progress, and a short "how to use this document" note for homeowner, lender and contractor. Written to be readable by all three.</w:t>
       </w:r>
     </w:p>
     <w:p>
@@ -324,7 +284,7 @@
         <w:t>Detailed Cost Plan</w:t>
       </w:r>
       <w:r>
-        <w:t xml:space="preserve"> — the same table plus the pricing basis per measure, the full loading methodology (base → O&amp;P + contingency → VAT) with a total that ties exactly to the customer headline, and an itemised appendix: every line item with quantity, unit, material rate and labour rate. Any figure a lender or SEAI questions can be traced from the headline down to a unit rate.</w:t>
+        <w:t xml:space="preserve"> — the same table with the pricing basis for each measure, the full loading methodology (base cost → overhead, profit and contingency → VAT) totalling to exactly the customer headline figure, and an itemised appendix giving every line item with its quantity, unit, material rate and labour rate. Any figure questioned can be traced from the headline down to a unit rate.</w:t>
       </w:r>
     </w:p>
     <w:p>
@@ -332,7 +292,7 @@
         <w:spacing w:after="120"/>
       </w:pPr>
       <w:r>
-        <w:t>Plus: per-measure grant breakdown (Better Energy Homes and One Stop Shop, current rates), the SEAI-registered trades required, and estimated-vs-actual cost tracking as works progress.</w:t>
+        <w:t>Alongside these: a per-measure grant breakdown for both Better Energy Homes and One Stop Shop at current rates, the SEAI-registered trades the project requires, and estimated-versus-actual cost tracking.</w:t>
       </w:r>
     </w:p>
     <w:p>
@@ -345,7 +305,7 @@
           <w:color w:val="1E293B"/>
           <w:sz w:val="24"/>
         </w:rPr>
-        <w:t>Who uses it</w:t>
+        <w:t>Who benefits, and how</w:t>
       </w:r>
     </w:p>
     <w:tbl>
@@ -413,7 +373,7 @@
               <w:rPr>
                 <w:sz w:val="19"/>
               </w:rPr>
-              <w:t>Understand costs before engaging contractors. Compare quotes against an independent estimate. Track budget during works.</w:t>
+              <w:t>Understand the real cost before engaging anyone. Compare contractor quotes against an independent estimate. Track spend during works.</w:t>
             </w:r>
           </w:p>
         </w:tc>
@@ -443,7 +403,7 @@
               <w:rPr>
                 <w:sz w:val="19"/>
               </w:rPr>
-              <w:t>Turn a certificate into a complete budget conversation during the assessment visit.</w:t>
+              <w:t>Add a costed plan to the improvement advice they already provide — turning an assessment into a complete, actionable conversation within the same visit.</w:t>
             </w:r>
           </w:p>
         </w:tc>
@@ -473,7 +433,7 @@
               <w:rPr>
                 <w:sz w:val="19"/>
               </w:rPr>
-              <w:t>A credible, contractor-independent cost document for green loan and mortgage applications.</w:t>
+              <w:t>A consistent, contractor-independent cost document to support green loan and mortgage applications.</w:t>
             </w:r>
           </w:p>
         </w:tc>
@@ -503,7 +463,7 @@
               <w:rPr>
                 <w:sz w:val="19"/>
               </w:rPr>
-              <w:t>Fast feasibility costing and project pre-qualification before full survey.</w:t>
+              <w:t>Fast feasibility costing and project pre-qualification before committing to a full survey.</w:t>
             </w:r>
           </w:p>
         </w:tc>
@@ -533,7 +493,7 @@
               <w:rPr>
                 <w:sz w:val="19"/>
               </w:rPr>
-              <w:t>A structured scope-of-works to quote from, with a published rate basis.</w:t>
+              <w:t>A structured scope of works to quote against, with a published, transparent rate basis.</w:t>
             </w:r>
           </w:p>
         </w:tc>
@@ -563,7 +523,7 @@
               <w:rPr>
                 <w:sz w:val="19"/>
               </w:rPr>
-              <w:t>Rapid bulk estimation and budget forecasting for estate retrofit programmes.</w:t>
+              <w:t>Rapid bulk estimation and budget forecasting for estate-wide retrofit programmes.</w:t>
             </w:r>
           </w:p>
         </w:tc>
@@ -593,7 +553,7 @@
               <w:rPr>
                 <w:sz w:val="19"/>
               </w:rPr>
-              <w:t>Real-market cost data to calibrate grant rates and monitor programme value for money.</w:t>
+              <w:t>Real-market cost evidence to calibrate grant rates, plus a consistent way to show homeowners what an upgrade genuinely costs.</w:t>
             </w:r>
           </w:p>
         </w:tc>
@@ -623,7 +583,7 @@
               <w:rPr>
                 <w:sz w:val="19"/>
               </w:rPr>
-              <w:t>Retrofit cost disclosure on listings and in transactions.</w:t>
+              <w:t>Retrofit cost disclosure on listings and during transactions.</w:t>
             </w:r>
           </w:p>
         </w:tc>
@@ -647,7 +607,7 @@
         <w:spacing w:after="120"/>
       </w:pPr>
       <w:r>
-        <w:t>The trial exists to convert PlanitBER's stated accuracy (±15–20%) from a claim into evidence, and to prove the tool fits SEAI's real workflows. Four objectives:</w:t>
+        <w:t>The trial exists to convert PlanitBER's stated accuracy (±15–20%) from a claim into published evidence, and to prove the tool works in the field before SEAI puts its name near it. Four objectives:</w:t>
       </w:r>
     </w:p>
     <w:p>
@@ -667,7 +627,7 @@
         <w:spacing w:after="120"/>
       </w:pPr>
       <w:r>
-        <w:t>Run 50–100 live projects through PlanitBER alongside actual contractor quotes and One Stop Shop pricing, across dwelling types (detached, semi-D, terrace, bungalow, apartment), age bands, counties and both grant schemes. Publish the error distribution per measure — not just an average. Where a measure runs hot or cold, the rate book is corrected and the correction is dated and versioned.</w:t>
+        <w:t>Run 50–100 live projects through PlanitBER alongside actual contractor quotes and One Stop Shop pricing, spanning dwelling types (detached, semi-detached, terrace, bungalow, apartment), age bands, counties and both grant schemes. Publish the error distribution per measure, not merely an average. Where a measure prices consistently high or low, the rate book is corrected and the correction is dated and recorded.</w:t>
       </w:r>
     </w:p>
     <w:p>
@@ -687,7 +647,7 @@
         <w:spacing w:after="120"/>
       </w:pPr>
       <w:r>
-        <w:t>Measure the time from completed BER survey to issued cost plan, and whether assessors can produce it during the visit. Success is a cost plan in the homeowner's hand in the same appointment as the certificate.</w:t>
+        <w:t>Measure the time from completed survey to issued cost plan, and confirm assessors can produce it within the visit without specialist QS knowledge. Success is a cost plan in the homeowner's hand at the same appointment.</w:t>
       </w:r>
     </w:p>
     <w:p>
@@ -699,7 +659,7 @@
           <w:b/>
           <w:color w:val="1E293B"/>
         </w:rPr>
-        <w:t>Capture the first actuals dataset.</w:t>
+        <w:t>Capture the first actual-cost dataset.</w:t>
       </w:r>
     </w:p>
     <w:p>
@@ -707,16 +667,7 @@
         <w:spacing w:after="120"/>
       </w:pPr>
       <w:r>
-        <w:t xml:space="preserve">Every trial project's estimated-vs-actual figures, per measure per county, become the seed of a retrofit out-turn cost dataset that currently does not exist anywhere in the programme. Aggregated and anonymised, this is offered back to SEAI as trial output — evidence of what retrofits </w:t>
-      </w:r>
-      <w:r>
-        <w:rPr>
-          <w:i/>
-        </w:rPr>
-        <w:t>actually cost</w:t>
-      </w:r>
-      <w:r>
-        <w:t>, independent of what anyone quoted.</w:t>
+        <w:t>Every trial project's estimated-versus-actual figures, per measure and per county, seed a retrofit out-turn cost dataset that does not currently exist anywhere in the programme. Aggregated and anonymised, this is offered to SEAI as a direct output of the trial — evidence of what retrofits actually cost, independent of what anyone quoted.</w:t>
       </w:r>
     </w:p>
     <w:p>
@@ -736,7 +687,7 @@
         <w:spacing w:after="120"/>
       </w:pPr>
       <w:r>
-        <w:t>The trial period formalises the rate book: named sources (SEO Wage Agreement, SCSI Regional Cost Supplement, merchant pricing), a published review cadence aligned to SEAI's February/March grant revisions, and a versioned change log. SEAI should be able to ask "what did the tool assume on any given date?" and get an exact answer.</w:t>
+        <w:t>The trial formalises the rate book: named sources (SEO National Wage Agreement, SCSI Regional Cost Supplement, Irish merchant pricing), a published review cycle aligned to SEAI's annual grant revisions, and a versioned change log. SEAI should be able to ask what the tool assumed on any given date and receive an exact answer.</w:t>
       </w:r>
     </w:p>
     <w:p>
@@ -748,10 +699,10 @@
           <w:b/>
           <w:color w:val="1E293B"/>
         </w:rPr>
-        <w:t>Trial success criteria, stated up front:</w:t>
+        <w:t>Success criteria, stated in advance:</w:t>
       </w:r>
       <w:r>
-        <w:t xml:space="preserve"> measured accuracy within the published band for ≥80% of projects; cost plan issued same-day for ≥90% of assessments; a documented rate-correction cycle completed; homeowner conversion (assessment → grant application) tracked against a control group.</w:t>
+        <w:t xml:space="preserve"> measured accuracy within the published band on at least 80% of projects; a cost plan issued same-day on at least 90% of assessments; a documented rate-correction cycle completed; and homeowner progression from assessment to grant application tracked against a comparison group.</w:t>
       </w:r>
     </w:p>
     <w:p>
@@ -776,7 +727,7 @@
           <w:b/>
           <w:color w:val="1E293B"/>
         </w:rPr>
-        <w:t>The costed Advisory Report — the default next step after every BER.</w:t>
+        <w:t>A recognised standard for indicative retrofit costs.</w:t>
       </w:r>
     </w:p>
     <w:p>
@@ -784,17 +735,7 @@
         <w:spacing w:after="120"/>
       </w:pPr>
       <w:r>
-        <w:t xml:space="preserve">Ireland publishes roughly 100,000 BERs a year, and every one produces two things PlanitBER needs: a DEAP file holding the geometry (floor, wall, roof and window areas, age band, heat loss data) and an </w:t>
-      </w:r>
-      <w:r>
-        <w:rPr>
-          <w:b/>
-          <w:color w:val="1E293B"/>
-        </w:rPr>
-        <w:t>Advisory Report holding the recommended measures</w:t>
-      </w:r>
-      <w:r>
-        <w:t>. Between them they are a complete PlanitBER input — the survey has already been done, by a registered assessor, under SEAI's own quality regime.</w:t>
+        <w:t>Ireland completes roughly 100,000 home energy assessments a year. Every one is an opportunity to give a homeowner a credible number — and today almost none of them do. With SEAI recognition, PlanitBER becomes the consistent, independent format in which that number is given: the same methodology, the same loading basis, and the same grant treatment nationwide, whether the homeowner is in Dublin or Ballymote.</w:t>
       </w:r>
     </w:p>
     <w:p>
@@ -802,209 +743,37 @@
         <w:spacing w:after="120"/>
       </w:pPr>
       <w:r>
-        <w:t xml:space="preserve">With SEAI's cooperation on the file format, the workflow becomes: </w:t>
+        <w:rPr>
+          <w:b/>
+          <w:color w:val="1E293B"/>
+        </w:rPr>
+        <w:t>A stronger advisory service from assessors.</w:t>
+      </w:r>
+    </w:p>
+    <w:p>
+      <w:pPr>
+        <w:spacing w:after="120"/>
+      </w:pPr>
+      <w:r>
+        <w:t xml:space="preserve">Assessors are the profession best placed to deliver this — they are already in the home, already measuring, and already trusted to advise on improvements. PlanitBER extends that advisory role from </w:t>
       </w:r>
       <w:r>
         <w:rPr>
           <w:i/>
         </w:rPr>
-        <w:t>upload the BER export and Advisory Report → costed, grant-netted plan in sixty seconds.</w:t>
+        <w:t>what to do</w:t>
       </w:r>
       <w:r>
-        <w:t xml:space="preserve"> No re-surveying, no re-keying, no transcription error. This is the "add-on to DEAP" in its practical form, and it completes a natural set of three documents:</w:t>
+        <w:t xml:space="preserve"> to </w:t>
       </w:r>
-    </w:p>
-    <w:tbl>
-      <w:tblPr>
-        <w:tblStyle w:val="LightGrid-Accent1"/>
-        <w:tblW w:type="auto" w:w="0"/>
-        <w:tblLook w:firstColumn="1" w:firstRow="1" w:lastColumn="0" w:lastRow="0" w:noHBand="0" w:noVBand="1" w:val="04A0"/>
-      </w:tblPr>
-      <w:tblGrid>
-        <w:gridCol w:w="3249"/>
-        <w:gridCol w:w="3249"/>
-        <w:gridCol w:w="3249"/>
-      </w:tblGrid>
-      <w:tr>
-        <w:tc>
-          <w:tcPr>
-            <w:tcW w:type="dxa" w:w="3249"/>
-          </w:tcPr>
-          <w:p>
-            <w:r>
-              <w:rPr>
-                <w:b/>
-                <w:sz w:val="19"/>
-              </w:rPr>
-              <w:t>Document</w:t>
-            </w:r>
-          </w:p>
-        </w:tc>
-        <w:tc>
-          <w:tcPr>
-            <w:tcW w:type="dxa" w:w="3249"/>
-          </w:tcPr>
-          <w:p>
-            <w:r>
-              <w:rPr>
-                <w:b/>
-                <w:sz w:val="19"/>
-              </w:rPr>
-              <w:t>Answers</w:t>
-            </w:r>
-          </w:p>
-        </w:tc>
-        <w:tc>
-          <w:tcPr>
-            <w:tcW w:type="dxa" w:w="3249"/>
-          </w:tcPr>
-          <w:p>
-            <w:r>
-              <w:rPr>
-                <w:b/>
-                <w:sz w:val="19"/>
-              </w:rPr>
-              <w:t>Issued by</w:t>
-            </w:r>
-          </w:p>
-        </w:tc>
-      </w:tr>
-      <w:tr>
-        <w:tc>
-          <w:tcPr>
-            <w:tcW w:type="dxa" w:w="3249"/>
-          </w:tcPr>
-          <w:p>
-            <w:r>
-              <w:rPr>
-                <w:sz w:val="19"/>
-              </w:rPr>
-              <w:t>BER Certificate</w:t>
-            </w:r>
-          </w:p>
-        </w:tc>
-        <w:tc>
-          <w:tcPr>
-            <w:tcW w:type="dxa" w:w="3249"/>
-          </w:tcPr>
-          <w:p>
-            <w:r>
-              <w:rPr>
-                <w:sz w:val="19"/>
-              </w:rPr>
-              <w:t>How does this home perform?</w:t>
-            </w:r>
-          </w:p>
-        </w:tc>
-        <w:tc>
-          <w:tcPr>
-            <w:tcW w:type="dxa" w:w="3249"/>
-          </w:tcPr>
-          <w:p>
-            <w:r>
-              <w:rPr>
-                <w:sz w:val="19"/>
-              </w:rPr>
-              <w:t>SEAI / assessor</w:t>
-            </w:r>
-          </w:p>
-        </w:tc>
-      </w:tr>
-      <w:tr>
-        <w:tc>
-          <w:tcPr>
-            <w:tcW w:type="dxa" w:w="3249"/>
-          </w:tcPr>
-          <w:p>
-            <w:r>
-              <w:rPr>
-                <w:sz w:val="19"/>
-              </w:rPr>
-              <w:t>BER Advisory Report</w:t>
-            </w:r>
-          </w:p>
-        </w:tc>
-        <w:tc>
-          <w:tcPr>
-            <w:tcW w:type="dxa" w:w="3249"/>
-          </w:tcPr>
-          <w:p>
-            <w:r>
-              <w:rPr>
-                <w:sz w:val="19"/>
-              </w:rPr>
-              <w:t>What should be done about it?</w:t>
-            </w:r>
-          </w:p>
-        </w:tc>
-        <w:tc>
-          <w:tcPr>
-            <w:tcW w:type="dxa" w:w="3249"/>
-          </w:tcPr>
-          <w:p>
-            <w:r>
-              <w:rPr>
-                <w:sz w:val="19"/>
-              </w:rPr>
-              <w:t>SEAI / assessor</w:t>
-            </w:r>
-          </w:p>
-        </w:tc>
-      </w:tr>
-      <w:tr>
-        <w:tc>
-          <w:tcPr>
-            <w:tcW w:type="dxa" w:w="3249"/>
-          </w:tcPr>
-          <w:p>
-            <w:r>
-              <w:rPr>
-                <w:b/>
-                <w:color w:val="1E293B"/>
-                <w:sz w:val="19"/>
-              </w:rPr>
-              <w:t>PlanitBER Cost Plan</w:t>
-            </w:r>
-          </w:p>
-        </w:tc>
-        <w:tc>
-          <w:tcPr>
-            <w:tcW w:type="dxa" w:w="3249"/>
-          </w:tcPr>
-          <w:p>
-            <w:r>
-              <w:rPr>
-                <w:b/>
-                <w:color w:val="1E293B"/>
-                <w:sz w:val="19"/>
-              </w:rPr>
-              <w:t>What will that cost, net of grants?</w:t>
-            </w:r>
-          </w:p>
-        </w:tc>
-        <w:tc>
-          <w:tcPr>
-            <w:tcW w:type="dxa" w:w="3249"/>
-          </w:tcPr>
-          <w:p>
-            <w:r>
-              <w:rPr>
-                <w:b/>
-                <w:color w:val="1E293B"/>
-                <w:sz w:val="19"/>
-              </w:rPr>
-              <w:t>PlanitBER</w:t>
-            </w:r>
-          </w:p>
-        </w:tc>
-      </w:tr>
-    </w:tbl>
-    <w:p>
-      <w:pPr>
-        <w:spacing w:after="120"/>
-      </w:pPr>
       <w:r>
-        <w:t>The first two are mandatory and already national. The third is the one the homeowner cannot get today.</w:t>
+        <w:rPr>
+          <w:i/>
+        </w:rPr>
+        <w:t>what it costs</w:t>
+      </w:r>
+      <w:r>
+        <w:t>, without requiring quantity surveying expertise. That makes the assessment visit more valuable to the homeowner and more commercially attractive to the assessor.</w:t>
       </w:r>
     </w:p>
     <w:p>
@@ -1024,7 +793,7 @@
         <w:spacing w:after="120"/>
       </w:pPr>
       <w:r>
-        <w:t>At scale, the estimated-vs-actual dataset becomes a live index of retrofit costs per measure, per dwelling type, per county — the reference SEAI needs to calibrate grant rates annually, detect regional price anomalies, and demonstrate value for money to the Exchequer. Nobody holds this data today. The tool that produces the estimates is the natural instrument to collect the outcomes.</w:t>
+        <w:t>At scale, the estimated-versus-actual dataset becomes a live index of retrofit costs by measure, dwelling type and county — the reference SEAI needs to calibrate grant rates, identify regional price anomalies, and demonstrate value for money. Nobody holds this data today, and the tool producing the estimates is the natural instrument to collect the outcomes.</w:t>
       </w:r>
     </w:p>
     <w:p>
@@ -1036,7 +805,7 @@
           <w:b/>
           <w:color w:val="1E293B"/>
         </w:rPr>
-        <w:t>A compliance-aware eligibility engine.</w:t>
+        <w:t>Grant-application support.</w:t>
       </w:r>
     </w:p>
     <w:p>
@@ -1044,7 +813,7 @@
         <w:spacing w:after="120"/>
       </w:pPr>
       <w:r>
-        <w:t>The next build step is encoding SEAI's eligibility gates directly into the tool — year-built rules for insulation and heat pump grants, the post-works HLI ≤ 2.3 W/m²K technical assessment threshold, measure-combination rules — so a plan that prices a grant is a plan that qualifies for it. Assessors stop making eligibility mistakes; SEAI stops processing applications that were never eligible.</w:t>
+        <w:t>As accuracy is proven, a PlanitBER cost plan could serve as a standard supporting document in grant applications — giving SEAI a consistent, itemised statement of intended works and expected cost at the point of application, and a benchmark against which final invoices can be sense-checked. This is a longer-term possibility rather than a near-term proposal, but the format is already built for it.</w:t>
       </w:r>
     </w:p>
     <w:p>
@@ -1056,7 +825,7 @@
           <w:b/>
           <w:color w:val="1E293B"/>
         </w:rPr>
-        <w:t>The standard document for retrofit finance.</w:t>
+        <w:t>Eligibility awareness.</w:t>
       </w:r>
     </w:p>
     <w:p>
@@ -1064,7 +833,27 @@
         <w:spacing w:after="120"/>
       </w:pPr>
       <w:r>
-        <w:t>Banks and credit unions writing green loans need a consistent, contractor-independent cost basis. A recognised PlanitBER cost plan — one format, reconcilable, grant-aware — is the missing standard attachment for the Home Energy Upgrade Loan Scheme.</w:t>
+        <w:t>The next development step is encoding SEAI's eligibility rules directly into the tool — year-of-construction thresholds, the post-works Heat Loss Indicator requirement for heat pump grants, and measure-combination rules — so a plan that prices a grant is a plan that qualifies for it. Fewer ineligible applications reach SEAI, and fewer homeowners are disappointed late.</w:t>
+      </w:r>
+    </w:p>
+    <w:p>
+      <w:pPr>
+        <w:spacing w:after="120"/>
+      </w:pPr>
+      <w:r>
+        <w:rPr>
+          <w:b/>
+          <w:color w:val="1E293B"/>
+        </w:rPr>
+        <w:t>The standard cost document for retrofit finance.</w:t>
+      </w:r>
+    </w:p>
+    <w:p>
+      <w:pPr>
+        <w:spacing w:after="120"/>
+      </w:pPr>
+      <w:r>
+        <w:t>Banks and credit unions writing green loans need a consistent, contractor-independent cost basis. A recognised PlanitBER cost plan — one format, fully reconcilable, grant-aware — is the missing standard attachment for retrofit lending.</w:t>
       </w:r>
     </w:p>
     <w:p>
@@ -1084,7 +873,7 @@
         <w:spacing w:after="120"/>
       </w:pPr>
       <w:r>
-        <w:t>The same engine and report format already extend to refurbishment-plus-extension and new build, so deep retrofits that grow into bigger projects stay inside one consistent costing framework.</w:t>
+        <w:t>The same engine and report format already extend to refurbishment, extensions and new build, so a deep retrofit that grows into a larger project stays within one consistent costing framework.</w:t>
       </w:r>
     </w:p>
     <w:p>
@@ -1097,7 +886,7 @@
           <w:color w:val="1E293B"/>
           <w:sz w:val="24"/>
         </w:rPr>
-        <w:t>The partnership path</w:t>
+        <w:t>The path we propose</w:t>
       </w:r>
     </w:p>
     <w:p>
@@ -1109,10 +898,10 @@
           <w:b/>
           <w:color w:val="1E293B"/>
         </w:rPr>
-        <w:t>Pilot</w:t>
+        <w:t>Trial</w:t>
       </w:r>
       <w:r>
-        <w:t xml:space="preserve"> — the trial above: accuracy report, actuals dataset, rate governance, delivered to SEAI.</w:t>
+        <w:t xml:space="preserve"> — as set out above: accuracy report, actual-cost dataset and rate governance, delivered to SEAI.</w:t>
       </w:r>
     </w:p>
     <w:p>
@@ -1127,7 +916,7 @@
         <w:t>Recognition</w:t>
       </w:r>
       <w:r>
-        <w:t xml:space="preserve"> — PlanitBER as a recognised indicative costing tool for assessors and One Stop Shops, with the rate-book maintenance commitment.</w:t>
+        <w:t xml:space="preserve"> — PlanitBER approved and promoted as an indicative costing tool for assessors, One Stop Shops and homeowners, backed by our published rate-maintenance commitment.</w:t>
       </w:r>
     </w:p>
     <w:p>
@@ -1139,10 +928,10 @@
           <w:b/>
           <w:color w:val="1E293B"/>
         </w:rPr>
-        <w:t>Integration</w:t>
+        <w:t>Wider role</w:t>
       </w:r>
       <w:r>
-        <w:t xml:space="preserve"> — the BER file and Advisory Report handshake, making the costed plan the standard companion to every Advisory Report issued in the country.</w:t>
+        <w:t xml:space="preserve"> — subject to proven accuracy, use of the cost plan to support grant applications and retrofit lending.</w:t>
       </w:r>
     </w:p>
     <w:p>
@@ -1150,7 +939,7 @@
         <w:spacing w:after="120"/>
       </w:pPr>
       <w:r>
-        <w:t>Each step gives SEAI something concrete — evidence, data, homeowner conversion — before asking for the next. The only thing PlanitBER asks of SEAI is access to the file formats for consenting homeowners; everything else is built and maintained on our side.</w:t>
+        <w:t>Each step gives SEAI something concrete — evidence, cost data, higher homeowner conversion — before anything further is asked. PlanitBER is developed, maintained and funded entirely by Turley Energy Consultants; SEAI's role is endorsement and promotion, not build or spend.</w:t>
       </w:r>
     </w:p>
     <w:p>

</xml_diff>

<commit_message>
Value proposition: commercial basis, SEAI oversight offer, numbering fix
- New 'Commercial basis, governance and risk' section: commercial
  model (free to homeowners, assessor licence, no commission or
  referral income), SEAI oversight of the rate book offered as a
  condition of recognition, liability position, GDPR treatment of
  the actual-cost dataset, and a six-month trial timeline
- Opening ask now states PlanitBER is built by practising assessors
  and used by assessors, One Stop Shops and homeowners; standalone
  but open to SEAI supervision
- Fix Word numbering: literal numbers instead of List Number style,
  which continued across lists and rendered the path as 3/4/5

Licence fee left as a placeholder for John to set.

Co-Authored-By: Claude Opus 5 <noreply@anthropic.com>
Claude-Session: https://claude.ai/code/session_017c6VtAdYwGJhpVqbEFh3tW
</commit_message>
<xml_diff>
--- a/PlanitBER_Value_Proposition.docx
+++ b/PlanitBER_Value_Proposition.docx
@@ -29,7 +29,7 @@
         <w:spacing w:after="120"/>
       </w:pPr>
       <w:r>
-        <w:t>PlanitBER turns a completed home survey into a clear, grant-netted, finance-ready budget in under two minutes — itemised in the format a quantity surveyor would use, and independent of any contractor.</w:t>
+        <w:t>PlanitBER turns a completed home survey into a clear, grant-netted, finance-ready budget in under two minutes — itemised in the format a quantity surveyor would use, and independent of any contractor. It is built by practising BER assessors, for the people who do this work every day.</w:t>
       </w:r>
     </w:p>
     <w:p>
@@ -44,7 +44,16 @@
         <w:t>What we are asking of SEAI:</w:t>
       </w:r>
       <w:r>
-        <w:t xml:space="preserve"> recognition and promotion of PlanitBER as an approved indicative costing tool for BER assessors, One Stop Shops and homeowners. PlanitBER is standalone software. It requires no integration with SEAI systems, no change to DEAP, and no development effort on SEAI's side.</w:t>
+        <w:t xml:space="preserve"> recognition and promotion of PlanitBER as an approved indicative costing tool, used by BER assessors, One Stop Shops and homeowners. PlanitBER is standalone software: it requires no integration with SEAI systems, no change to DEAP, and no development effort or expenditure on SEAI's side. Standalone does not mean unsupervised — we would welcome SEAI oversight of the costing methodology and rate book as a condition of that recognition (see </w:t>
+      </w:r>
+      <w:r>
+        <w:rPr>
+          <w:i/>
+        </w:rPr>
+        <w:t>Commercial basis, governance and risk</w:t>
+      </w:r>
+      <w:r>
+        <w:t>).</w:t>
       </w:r>
     </w:p>
     <w:p>
@@ -259,8 +268,16 @@
     </w:p>
     <w:p>
       <w:pPr>
-        <w:pStyle w:val="ListNumber"/>
+        <w:spacing w:after="80"/>
+        <w:ind w:left="454" w:hanging="454"/>
       </w:pPr>
+      <w:r>
+        <w:rPr>
+          <w:b/>
+          <w:color w:val="1E293B"/>
+        </w:rPr>
+        <w:t xml:space="preserve">1.  </w:t>
+      </w:r>
       <w:r>
         <w:rPr>
           <w:b/>
@@ -274,8 +291,16 @@
     </w:p>
     <w:p>
       <w:pPr>
-        <w:pStyle w:val="ListNumber"/>
+        <w:spacing w:after="80"/>
+        <w:ind w:left="454" w:hanging="454"/>
       </w:pPr>
+      <w:r>
+        <w:rPr>
+          <w:b/>
+          <w:color w:val="1E293B"/>
+        </w:rPr>
+        <w:t xml:space="preserve">2.  </w:t>
+      </w:r>
       <w:r>
         <w:rPr>
           <w:b/>
@@ -403,7 +428,7 @@
               <w:rPr>
                 <w:sz w:val="19"/>
               </w:rPr>
-              <w:t>Add a costed plan to the improvement advice they already provide — turning an assessment into a complete, actionable conversation within the same visit.</w:t>
+              <w:t>Add a costed plan to the improvement advice they already provide, within the same visit — turning an assessment into a complete, actionable conversation. Built by assessors, so it asks only for measurements they already take.</w:t>
             </w:r>
           </w:p>
         </w:tc>
@@ -707,6 +732,94 @@
     </w:p>
     <w:p>
       <w:pPr>
+        <w:spacing w:after="120"/>
+      </w:pPr>
+      <w:r>
+        <w:rPr>
+          <w:b/>
+          <w:color w:val="1E293B"/>
+        </w:rPr>
+        <w:t>Timeline.</w:t>
+      </w:r>
+      <w:r>
+        <w:t xml:space="preserve"> Six months from approval: two months recruiting participating assessors and One Stop Shops, three months collecting projects with matched quotes and actual costs, and a final month for analysis and reporting to SEAI.</w:t>
+      </w:r>
+    </w:p>
+    <w:p>
+      <w:pPr>
+        <w:spacing w:before="200" w:after="60"/>
+      </w:pPr>
+      <w:r>
+        <w:rPr>
+          <w:b/>
+          <w:color w:val="1E293B"/>
+          <w:sz w:val="24"/>
+        </w:rPr>
+        <w:t>Commercial basis, governance and risk</w:t>
+      </w:r>
+    </w:p>
+    <w:p>
+      <w:pPr>
+        <w:spacing w:after="120"/>
+      </w:pPr>
+      <w:r>
+        <w:rPr>
+          <w:b/>
+          <w:color w:val="1E293B"/>
+        </w:rPr>
+        <w:t>Commercial model.</w:t>
+      </w:r>
+      <w:r>
+        <w:t xml:space="preserve"> PlanitBER is free to homeowners. Assessors and One Stop Shops access it under an annual licence of €[fee]. No commission, referral fee, lead-generation payment or contractor advertising is taken from any party — independence from everyone selling the works is the point of the tool, and it will not be compromised.</w:t>
+      </w:r>
+    </w:p>
+    <w:p>
+      <w:pPr>
+        <w:spacing w:after="120"/>
+      </w:pPr>
+      <w:r>
+        <w:rPr>
+          <w:b/>
+          <w:color w:val="1E293B"/>
+        </w:rPr>
+        <w:t>SEAI oversight.</w:t>
+      </w:r>
+      <w:r>
+        <w:t xml:space="preserve"> Standalone software does not have to mean unsupervised software. We would welcome a formal SEAI role in governing the methodology: the rate book, its sources and every revision made available for SEAI review, with all rate and loading changes published and dated. If SEAI would prefer to approve the rate book annually, or to set parameters the tool must apply, we would accept that as a condition of recognition. Oversight strengthens the tool's credibility and gives SEAI direct assurance over what is being published in its name.</w:t>
+      </w:r>
+    </w:p>
+    <w:p>
+      <w:pPr>
+        <w:spacing w:after="120"/>
+      </w:pPr>
+      <w:r>
+        <w:rPr>
+          <w:b/>
+          <w:color w:val="1E293B"/>
+        </w:rPr>
+        <w:t>Liability.</w:t>
+      </w:r>
+      <w:r>
+        <w:t xml:space="preserve"> Every output is labelled an indicative estimate — not a quotation, contract or guarantee of final cost — with the accuracy band printed on the face of the document and the reminder that only SEAI-registered contractors qualify for grant payment. Professional indemnity insurance is carried by Turley Energy Consultants. Recognition by SEAI would carry no liability for costs incurred by homeowners or contractors.</w:t>
+      </w:r>
+    </w:p>
+    <w:p>
+      <w:pPr>
+        <w:spacing w:after="120"/>
+      </w:pPr>
+      <w:r>
+        <w:rPr>
+          <w:b/>
+          <w:color w:val="1E293B"/>
+        </w:rPr>
+        <w:t>Data protection.</w:t>
+      </w:r>
+      <w:r>
+        <w:t xml:space="preserve"> Project data remains with the assessor who created it. The actual-cost dataset offered to SEAI is aggregated and anonymised — measure, dwelling type, county and cost only, with no address or personal data — and homeowner consent is obtained before any project's figures are included.</w:t>
+      </w:r>
+    </w:p>
+    <w:p>
+      <w:pPr>
         <w:spacing w:before="280" w:after="80"/>
       </w:pPr>
       <w:r>
@@ -891,8 +1004,16 @@
     </w:p>
     <w:p>
       <w:pPr>
-        <w:pStyle w:val="ListNumber"/>
+        <w:spacing w:after="80"/>
+        <w:ind w:left="454" w:hanging="454"/>
       </w:pPr>
+      <w:r>
+        <w:rPr>
+          <w:b/>
+          <w:color w:val="1E293B"/>
+        </w:rPr>
+        <w:t xml:space="preserve">1.  </w:t>
+      </w:r>
       <w:r>
         <w:rPr>
           <w:b/>
@@ -906,8 +1027,16 @@
     </w:p>
     <w:p>
       <w:pPr>
-        <w:pStyle w:val="ListNumber"/>
+        <w:spacing w:after="80"/>
+        <w:ind w:left="454" w:hanging="454"/>
       </w:pPr>
+      <w:r>
+        <w:rPr>
+          <w:b/>
+          <w:color w:val="1E293B"/>
+        </w:rPr>
+        <w:t xml:space="preserve">2.  </w:t>
+      </w:r>
       <w:r>
         <w:rPr>
           <w:b/>
@@ -916,13 +1045,21 @@
         <w:t>Recognition</w:t>
       </w:r>
       <w:r>
-        <w:t xml:space="preserve"> — PlanitBER approved and promoted as an indicative costing tool for assessors, One Stop Shops and homeowners, backed by our published rate-maintenance commitment.</w:t>
+        <w:t xml:space="preserve"> — PlanitBER approved and promoted as an indicative costing tool, used by assessors, One Stop Shops and homeowners, backed by our published rate-maintenance commitment and whatever oversight arrangement SEAI wishes to put in place.</w:t>
       </w:r>
     </w:p>
     <w:p>
       <w:pPr>
-        <w:pStyle w:val="ListNumber"/>
+        <w:spacing w:after="80"/>
+        <w:ind w:left="454" w:hanging="454"/>
       </w:pPr>
+      <w:r>
+        <w:rPr>
+          <w:b/>
+          <w:color w:val="1E293B"/>
+        </w:rPr>
+        <w:t xml:space="preserve">3.  </w:t>
+      </w:r>
       <w:r>
         <w:rPr>
           <w:b/>

</xml_diff>

<commit_message>
Open the door to SEAI trial co-funding and lead on partnership
The closing previously ruled funding out ('not build or spend'),
which foreclosed something worth having. Reframed so recognition
still costs SEAI nothing, while the trial — which produces a public
dataset rather than a private product — is offered as something
SEAI may wish to co-fund or run under an existing research or
demonstration programme, with the dataset theirs to publish.

Closing now states the relationship sought: not a customer but a
partner — shared oversight, findings that belong to the sector, and
a common document the industry recognises.

Co-Authored-By: Claude Opus 5 <noreply@anthropic.com>
Claude-Session: https://claude.ai/code/session_017c6VtAdYwGJhpVqbEFh3tW
</commit_message>
<xml_diff>
--- a/PlanitBER_Value_Proposition.docx
+++ b/PlanitBER_Value_Proposition.docx
@@ -878,6 +878,21 @@
           <w:b/>
           <w:color w:val="1E293B"/>
         </w:rPr>
+        <w:t>Partnership and support for the trial.</w:t>
+      </w:r>
+      <w:r>
+        <w:t xml:space="preserve"> Recognition itself costs SEAI nothing, and we are not asking for funding to obtain it. The trial is a different proposition: it produces something that outlives any one tool — the first structured record of what Irish retrofits actually cost. We are prepared to fund and run it ourselves. If SEAI would prefer to co-fund it, or to run it under an existing research, pilot or demonstration programme, we would welcome that, and the resulting dataset would be SEAI's to publish as it sees fit. A trial conducted jointly would also carry considerably more weight with assessors, contractors and lenders than one we conduct alone.</w:t>
+      </w:r>
+    </w:p>
+    <w:p>
+      <w:pPr>
+        <w:spacing w:after="120"/>
+      </w:pPr>
+      <w:r>
+        <w:rPr>
+          <w:b/>
+          <w:color w:val="1E293B"/>
+        </w:rPr>
         <w:t>Liability.</w:t>
       </w:r>
       <w:r>
@@ -1105,7 +1120,15 @@
         <w:spacing w:after="120"/>
       </w:pPr>
       <w:r>
-        <w:t>Each step gives SEAI something concrete — evidence, cost data, higher homeowner conversion — before anything further is asked. PlanitBER is developed, maintained and funded entirely by Turley Energy Consultants; SEAI's role is endorsement and promotion, not build or spend.</w:t>
+        <w:t>Each step gives SEAI something concrete — evidence, cost data, higher homeowner conversion — before anything further is asked. PlanitBER is developed and maintained at our own cost, and recognition alone requires no expenditure by SEAI.</w:t>
+      </w:r>
+    </w:p>
+    <w:p>
+      <w:pPr>
+        <w:spacing w:after="120"/>
+      </w:pPr>
+      <w:r>
+        <w:t>What we are seeking, though, is not a customer but a partner. The retrofit sector needs a cost standard it can trust, and a tool the industry trusts is one SEAI stands over: shared oversight of the method, a trial whose findings belong to the sector rather than to us, and a common document that assessors, contractors, lenders and homeowners all recognise. We would rather build that with SEAI than alongside it.</w:t>
       </w:r>
     </w:p>
     <w:p>

</xml_diff>

<commit_message>
Add Turley Energy logo to Word documents
Logo placed at the top of the value proposition and the pack
contents index, 5.5cm wide.

Co-Authored-By: Claude Opus 5 <noreply@anthropic.com>
Claude-Session: https://claude.ai/code/session_017c6VtAdYwGJhpVqbEFh3tW
</commit_message>
<xml_diff>
--- a/PlanitBER_Value_Proposition.docx
+++ b/PlanitBER_Value_Proposition.docx
@@ -2,6 +2,45 @@
 <file path=word/document.xml><?xml version="1.0" encoding="utf-8"?>
 <w:document xmlns:wpc="http://schemas.microsoft.com/office/word/2010/wordprocessingCanvas" xmlns:mo="http://schemas.microsoft.com/office/mac/office/2008/main" xmlns:mc="http://schemas.openxmlformats.org/markup-compatibility/2006" xmlns:mv="urn:schemas-microsoft-com:mac:vml" xmlns:o="urn:schemas-microsoft-com:office:office" xmlns:r="http://schemas.openxmlformats.org/officeDocument/2006/relationships" xmlns:m="http://schemas.openxmlformats.org/officeDocument/2006/math" xmlns:v="urn:schemas-microsoft-com:vml" xmlns:wp14="http://schemas.microsoft.com/office/word/2010/wordprocessingDrawing" xmlns:wp="http://schemas.openxmlformats.org/drawingml/2006/wordprocessingDrawing" xmlns:w10="urn:schemas-microsoft-com:office:word" xmlns:w="http://schemas.openxmlformats.org/wordprocessingml/2006/main" xmlns:w14="http://schemas.microsoft.com/office/word/2010/wordml" xmlns:wpg="http://schemas.microsoft.com/office/word/2010/wordprocessingGroup" xmlns:wpi="http://schemas.microsoft.com/office/word/2010/wordprocessingInk" xmlns:wne="http://schemas.microsoft.com/office/word/2006/wordml" xmlns:wps="http://schemas.microsoft.com/office/word/2010/wordprocessingShape" mc:Ignorable="w14 wp14">
   <w:body>
+    <w:p>
+      <w:pPr>
+        <w:spacing w:after="200"/>
+      </w:pPr>
+      <w:r>
+        <w:drawing>
+          <wp:inline xmlns:a="http://schemas.openxmlformats.org/drawingml/2006/main" xmlns:pic="http://schemas.openxmlformats.org/drawingml/2006/picture">
+            <wp:extent cx="1980000" cy="396000"/>
+            <wp:docPr id="1" name="Picture 1"/>
+            <wp:cNvGraphicFramePr>
+              <a:graphicFrameLocks noChangeAspect="1"/>
+            </wp:cNvGraphicFramePr>
+            <a:graphic>
+              <a:graphicData uri="http://schemas.openxmlformats.org/drawingml/2006/picture">
+                <pic:pic>
+                  <pic:nvPicPr>
+                    <pic:cNvPr id="0" name="logo-full.png"/>
+                    <pic:cNvPicPr/>
+                  </pic:nvPicPr>
+                  <pic:blipFill>
+                    <a:blip r:embed="rId9"/>
+                    <a:stretch>
+                      <a:fillRect/>
+                    </a:stretch>
+                  </pic:blipFill>
+                  <pic:spPr>
+                    <a:xfrm>
+                      <a:off x="0" y="0"/>
+                      <a:ext cx="1980000" cy="396000"/>
+                    </a:xfrm>
+                    <a:prstGeom prst="rect"/>
+                  </pic:spPr>
+                </pic:pic>
+              </a:graphicData>
+            </a:graphic>
+          </wp:inline>
+        </w:drawing>
+      </w:r>
+    </w:p>
     <w:p>
       <w:r>
         <w:rPr>

</xml_diff>

<commit_message>
Use PlanitBER logo in Word documents
The PlanitBER mark existed only as inline SVG in the app header, so
rendered it to a print-ready PNG on white (globe + wordmark, Planit
in navy rather than the app's white so it reads on a white page).
Replaces the Turley Energy logo at the top of the value proposition
and pack contents.

Co-Authored-By: Claude Opus 5 <noreply@anthropic.com>
Claude-Session: https://claude.ai/code/session_017c6VtAdYwGJhpVqbEFh3tW
</commit_message>
<xml_diff>
--- a/PlanitBER_Value_Proposition.docx
+++ b/PlanitBER_Value_Proposition.docx
@@ -9,7 +9,7 @@
       <w:r>
         <w:drawing>
           <wp:inline xmlns:a="http://schemas.openxmlformats.org/drawingml/2006/main" xmlns:pic="http://schemas.openxmlformats.org/drawingml/2006/picture">
-            <wp:extent cx="1980000" cy="396000"/>
+            <wp:extent cx="1655999" cy="409175"/>
             <wp:docPr id="1" name="Picture 1"/>
             <wp:cNvGraphicFramePr>
               <a:graphicFrameLocks noChangeAspect="1"/>
@@ -18,7 +18,7 @@
               <a:graphicData uri="http://schemas.openxmlformats.org/drawingml/2006/picture">
                 <pic:pic>
                   <pic:nvPicPr>
-                    <pic:cNvPr id="0" name="logo-full.png"/>
+                    <pic:cNvPr id="0" name="planitber-logo.png"/>
                     <pic:cNvPicPr/>
                   </pic:nvPicPr>
                   <pic:blipFill>
@@ -30,7 +30,7 @@
                   <pic:spPr>
                     <a:xfrm>
                       <a:off x="0" y="0"/>
-                      <a:ext cx="1980000" cy="396000"/>
+                      <a:ext cx="1655999" cy="409175"/>
                     </a:xfrm>
                     <a:prstGeom prst="rect"/>
                   </pic:spPr>

</xml_diff>

<commit_message>
Correct the assessor workflow — survey on site, document afterwards
The document claimed a cost plan 'in the homeowner's hand at the
same appointment' and 'produced during the assessment visit'. A BER
assessor surveys on site and produces the documentation afterwards;
nothing is published on the doorstep, so an assessor reading this
would have spotted it immediately.

Corrected in five places to the real sequence: the plan is produced
from measurements already taken and issued with the BER
documentation, with no return visit and no additional survey. The
efficiency claim is unchanged in substance — one survey, no
re-measuring — and is now accurate.

Co-Authored-By: Claude Opus 5 <noreply@anthropic.com>
Claude-Session: https://claude.ai/code/session_017c6VtAdYwGJhpVqbEFh3tW
</commit_message>
<xml_diff>
--- a/PlanitBER_Value_Proposition.docx
+++ b/PlanitBER_Value_Proposition.docx
@@ -76,7 +76,7 @@
         <w:spacing w:after="120"/>
       </w:pPr>
       <w:r>
-        <w:t>PlanitBER gives all of them one document, built on one published method, that each can read from their own side. It turns a completed home survey into a clear, itemised, grant-netted budget — produced during the assessment visit, set out in the format a quantity surveyor would use, and independent of anyone selling the works. It is built by practising BER assessors, for the people who do this work every day.</w:t>
+        <w:t>PlanitBER gives all of them one document, built on one published method, that each can read from their own side. It turns a completed home survey into a clear, itemised, grant-netted budget — produced from measurements the assessor has already taken, set out in the format a quantity surveyor would use, and independent of anyone selling the works. It is built by practising BER assessors, for the people who do this work every day.</w:t>
       </w:r>
     </w:p>
     <w:p>
@@ -497,7 +497,7 @@
               <w:rPr>
                 <w:sz w:val="19"/>
               </w:rPr>
-              <w:t>Add a costed plan to the improvement advice they already provide, within the same visit — turning an assessment into a complete, actionable conversation. Built by assessors, so it asks only for measurements they already take.</w:t>
+              <w:t>Add a costed plan to the improvement advice they already provide, issued with the BER documentation — turning an assessment into a complete, actionable conversation. Built by assessors, so it uses the survey already carried out and asks for no return visit.</w:t>
             </w:r>
           </w:p>
         </w:tc>
@@ -792,7 +792,7 @@
         <w:spacing w:after="120"/>
       </w:pPr>
       <w:r>
-        <w:t>Confirm assessors can produce a cost plan within the visit, without specialist quantity surveying knowledge. Success is a cost plan in the homeowner's hand at the same appointment.</w:t>
+        <w:t>Confirm assessors can produce a cost plan from a survey they have already carried out — without returning to the property, taking additional measurements, or applying specialist quantity surveying knowledge. Success is the cost plan issued to the homeowner alongside the BER documentation, as part of the same job rather than a separate exercise.</w:t>
       </w:r>
     </w:p>
     <w:p>
@@ -847,7 +847,7 @@
         <w:t>Success criteria, stated in advance:</w:t>
       </w:r>
       <w:r>
-        <w:t xml:space="preserve"> measured accuracy within the published band on at least 80% of projects; a cost plan issued same-day on at least 90% of assessments; a documented rate-correction cycle completed; and homeowner progression from assessment to grant application tracked against a comparison group.</w:t>
+        <w:t xml:space="preserve"> measured accuracy within the published band on at least 80% of projects; a cost plan issued with the BER documentation on at least 90% of assessments, with no return visit required; a documented rate-correction cycle completed; and homeowner progression from assessment to grant application tracked against a comparison group.</w:t>
       </w:r>
     </w:p>
     <w:p>
@@ -1011,7 +1011,7 @@
         <w:spacing w:after="120"/>
       </w:pPr>
       <w:r>
-        <w:t xml:space="preserve">Assessors are best placed to produce this — already in the home, already measuring, already trusted to advise on improvements. PlanitBER extends that advice from </w:t>
+        <w:t xml:space="preserve">Assessors are best placed to produce this — they have already surveyed the home, already hold the measurements, and are already trusted to advise on improvements. PlanitBER extends that advice from </w:t>
       </w:r>
       <w:r>
         <w:rPr>
@@ -1029,7 +1029,7 @@
         <w:t>what it costs</w:t>
       </w:r>
       <w:r>
-        <w:t>, making the visit more valuable to the homeowner and more commercially attractive to the assessor. Contractors gain from the same document: when every quote prices the same itemised scope, the lowest price is genuinely the best value rather than the one that omitted the most. Site visits stop being wasted on enquiries that were never going to proceed, mid-job disputes and variations fall because the scope was agreed in writing beforehand, and better-informed homeowners convert into work that would otherwise have stalled at the quote stage.</w:t>
+        <w:t>, using the survey already completed, making the assessment more valuable to the homeowner and more commercially attractive to the assessor. Contractors gain from the same document: when every quote prices the same itemised scope, the lowest price is genuinely the best value rather than the one that omitted the most. Site visits stop being wasted on enquiries that were never going to proceed, mid-job disputes and variations fall because the scope was agreed in writing beforehand, and better-informed homeowners convert into work that would otherwise have stalled at the quote stage.</w:t>
       </w:r>
     </w:p>
     <w:p>

</xml_diff>

<commit_message>
Cut the value proposition from 2,900 words to 1,700
Same argument, half the words. Four sections instead of three plus
sub-sections: the problem, how the Cost Plan answers it, the pilot,
what it can become.

- The sector-alignment case folded into the three answers rather than
  standing as its own section
- 'What it looks like' reduced to three sentences
- Governance, liability, data protection and access compressed from
  six paragraphs into one
- Part 3's four sub-sections reduced to two paragraphs
- Both tables kept — they carry a lot in little space

Co-Authored-By: Claude Opus 5 <noreply@anthropic.com>
Claude-Session: https://claude.ai/code/session_017c6VtAdYwGJhpVqbEFh3tW
</commit_message>
<xml_diff>
--- a/PlanitBER_Value_Proposition.docx
+++ b/PlanitBER_Value_Proposition.docx
@@ -68,7 +68,7 @@
         <w:spacing w:after="120"/>
       </w:pPr>
       <w:r>
-        <w:t>Retrofit stalls at the point where the parties stop speaking the same language. The assessor recommends measures, the homeowner guesses at the cost, the contractor quotes against an undefined scope, the lender asks for evidence nobody can supply, and SEAI pays grants against figures that were never reconciled to anything.</w:t>
+        <w:t>Retrofit stalls where the parties stop speaking the same language. The assessor recommends measures, the homeowner guesses at the cost, the contractor quotes against an undefined scope, the lender asks for evidence nobody can supply, and SEAI pays grants against figures that were never reconciled to anything.</w:t>
       </w:r>
     </w:p>
     <w:p>
@@ -86,15 +86,7 @@
         <w:t>Retrofit Cost Plan</w:t>
       </w:r>
       <w:r>
-        <w:t xml:space="preserve"> gives all of them one document, built on one published method, that each can read from their own side. It sets out the cost of every recommended measure, the SEAI grant against it, and the net figure the homeowner must fund — itemised in the format a quantity surveyor would use, and independent of anyone selling the works.</w:t>
-      </w:r>
-    </w:p>
-    <w:p>
-      <w:pPr>
-        <w:spacing w:after="120"/>
-      </w:pPr>
-      <w:r>
-        <w:t xml:space="preserve">It is produced by the </w:t>
+        <w:t xml:space="preserve"> gives all of them one document, built on one published method, that each can read from their own side: the cost of every recommended measure, the SEAI grant against it, and the net figure the homeowner must fund. It is produced by the </w:t>
       </w:r>
       <w:r>
         <w:rPr>
@@ -104,7 +96,7 @@
         <w:t>BER assessor</w:t>
       </w:r>
       <w:r>
-        <w:t xml:space="preserve"> from the survey they have already carried out, using PlanitBER: software built by practising BER assessors, for the people who do this work every day.</w:t>
+        <w:t xml:space="preserve"> from the survey already carried out, using PlanitBER — software built by practising BER assessors.</w:t>
       </w:r>
     </w:p>
     <w:p>
@@ -119,15 +111,7 @@
         <w:t>What we are asking of SEAI:</w:t>
       </w:r>
       <w:r>
-        <w:t xml:space="preserve"> a funded pilot partnership, leading to recognition of the Retrofit Cost Plan as a standard cost document for Irish home retrofit — and of PlanitBER as the means of producing it.</w:t>
-      </w:r>
-    </w:p>
-    <w:p>
-      <w:pPr>
-        <w:spacing w:after="120"/>
-      </w:pPr>
-      <w:r>
-        <w:t>Every figure in this pack was produced by working software, and that software is at demonstration stage. The pilot is what takes it from a demonstration to something the sector can rely on: rates and grant tables tuned against real prices, the method independently evidenced, and the remaining development completed. We are not asking SEAI to fund an idea. We are asking SEAI to help finish and prove something that already works.</w:t>
+        <w:t xml:space="preserve"> a funded pilot partnership, leading to recognition of the Retrofit Cost Plan as a standard cost document for Irish home retrofit. Every figure in this pack came from working software, and that software is at demonstration stage. We are not asking SEAI to fund an idea — we are asking for help to finish and prove something that already works.</w:t>
       </w:r>
     </w:p>
     <w:p>
@@ -140,20 +124,7 @@
           <w:color w:val="B07D1A"/>
           <w:sz w:val="30"/>
         </w:rPr>
-        <w:t>1. What It Is</w:t>
-      </w:r>
-    </w:p>
-    <w:p>
-      <w:pPr>
-        <w:spacing w:before="200" w:after="60"/>
-      </w:pPr>
-      <w:r>
-        <w:rPr>
-          <w:b/>
-          <w:color w:val="1E293B"/>
-          <w:sz w:val="24"/>
-        </w:rPr>
-        <w:t>The problem</w:t>
+        <w:t>1. The problem</w:t>
       </w:r>
     </w:p>
     <w:p>
@@ -171,7 +142,7 @@
         <w:t>500,000 homes to B2 or better by 2030</w:t>
       </w:r>
       <w:r>
-        <w:t>, and completion rates are well behind target. The obstacle is not awareness, and it is not the level of grant support. Three things stop homes being upgraded.</w:t>
+        <w:t xml:space="preserve"> and is well behind target. The obstacle is not awareness, and it is not the level of grant support.</w:t>
       </w:r>
     </w:p>
     <w:p>
@@ -185,13 +156,8 @@
         </w:rPr>
         <w:t>1. Cost uncertainty stops homeowners acting.</w:t>
       </w:r>
-    </w:p>
-    <w:p>
-      <w:pPr>
-        <w:spacing w:after="120"/>
-      </w:pPr>
       <w:r>
-        <w:t>A home energy assessment identifies what needs upgrading, but puts no price on it. Homeowners don't know whether the work in front of them means €8,000 or €80,000. Without a credible number they don't apply for grants, don't approach their bank, and don't proceed. The decision stalls at the budget question, and there is no trusted, independent answer to it.</w:t>
+        <w:t xml:space="preserve"> An assessment says what needs upgrading but puts no price on it. Homeowners don't know whether that means €8,000 or €80,000, so they don't apply for grants, don't approach their bank, and don't proceed.</w:t>
       </w:r>
     </w:p>
     <w:p>
@@ -205,13 +171,8 @@
         </w:rPr>
         <w:t>2. Without a reference point, a fair quote and an inflated one look identical.</w:t>
       </w:r>
-    </w:p>
-    <w:p>
-      <w:pPr>
-        <w:spacing w:after="120"/>
-      </w:pPr>
       <w:r>
-        <w:t>Homeowners have nothing to measure a price against, so suspicion attaches to every quote — including the great majority that are entirely fair. That costs honest contractors twice: they lose work to competitors who appear cheaper only because items were quietly left out, and they spend unpaid hours pricing enquiries whose budget expectations were never realistic. It costs the scheme too, because homeowners who suspect the grant simply becomes someone else's margin walk away.</w:t>
+        <w:t xml:space="preserve"> That costs honest contractors twice — they lose work to quotes that only look cheaper because items were left out, and they spend unpaid hours pricing enquiries that were never realistic. It costs the scheme too, because homeowners who suspect the grant becomes someone else's margin walk away.</w:t>
       </w:r>
     </w:p>
     <w:p>
@@ -225,34 +186,21 @@
         </w:rPr>
         <w:t>3. Nothing bridges assessment and action.</w:t>
       </w:r>
-    </w:p>
-    <w:p>
-      <w:pPr>
-        <w:spacing w:after="120"/>
-      </w:pPr>
       <w:r>
-        <w:t>The assessor surveys the home and advises on the improvements that would raise its rating. The homeowner is left with a list of recommendations and no way to act on them. The window in which they are most motivated closes before they have the one number they need.</w:t>
+        <w:t xml:space="preserve"> The homeowner is left with a list of recommendations and no way to act on them, and the window in which they were motivated closes.</w:t>
       </w:r>
     </w:p>
     <w:p>
       <w:pPr>
-        <w:spacing w:before="200" w:after="60"/>
+        <w:spacing w:before="280" w:after="80"/>
       </w:pPr>
       <w:r>
         <w:rPr>
           <w:b/>
-          <w:color w:val="1E293B"/>
-          <w:sz w:val="24"/>
+          <w:color w:val="B07D1A"/>
+          <w:sz w:val="30"/>
         </w:rPr>
-        <w:t>How the Retrofit Cost Plan answers them</w:t>
-      </w:r>
-    </w:p>
-    <w:p>
-      <w:pPr>
-        <w:spacing w:after="120"/>
-      </w:pPr>
-      <w:r>
-        <w:t>It is built from survey geometry the assessor has already measured — floor, wall, roof and window areas, age band and heat loss indicator — against a measure list that mirrors SEAI's grant structure.</w:t>
+        <w:t>2. How the Retrofit Cost Plan answers it</w:t>
       </w:r>
     </w:p>
     <w:p>
@@ -266,13 +214,8 @@
         </w:rPr>
         <w:t>1. It gives a credible number.</w:t>
       </w:r>
-    </w:p>
-    <w:p>
-      <w:pPr>
-        <w:spacing w:after="120"/>
-      </w:pPr>
       <w:r>
-        <w:t>An itemised budget, measure by measure, using county-adjusted labour rates and current Irish material pricing. Every figure is fully loaded: contractor's overhead and profit at 12%, contingency at 10%, and VAT at 13.5% (Solar PV at 0% per Revenue ruling). Heat pumps are sized from the Heat Loss Indicator to IS EN 12831 rather than estimated from floor area. The homeowner sees the cost of each measure, the grant against it, and the net figure they must fund.</w:t>
+        <w:t xml:space="preserve"> An itemised budget built from the geometry the assessor already measured, using county-adjusted labour and current Irish material pricing, fully loaded (overhead and profit 12%, contingency 10%, VAT 13.5%; Solar PV 0%). Heat pumps are sized from the Heat Loss Indicator to IS EN 12831, not estimated from floor area.</w:t>
       </w:r>
     </w:p>
     <w:p>
@@ -286,13 +229,8 @@
         </w:rPr>
         <w:t>2. It gives everyone the same reference point.</w:t>
       </w:r>
-    </w:p>
-    <w:p>
-      <w:pPr>
-        <w:spacing w:after="120"/>
-      </w:pPr>
       <w:r>
-        <w:t>Costs are set out independently of anyone selling the works, with grants deducted line by line. The homeowner can judge whether a quote is reasonable. The contractor prices a defined scope that every competitor is pricing too, with a published rate basis to stand over their figure when it is queried. Comparable quotes reward the contractor who priced the job properly rather than the one who left most out.</w:t>
+        <w:t xml:space="preserve"> Costs are set out independently of anyone selling the works, with grants deducted line by line. The homeowner can judge a quote; the contractor prices a defined scope that every competitor is pricing too, with a published rate basis to stand over their figure.</w:t>
       </w:r>
     </w:p>
     <w:p>
@@ -306,26 +244,8 @@
         </w:rPr>
         <w:t>3. It closes the gap between advice and action.</w:t>
       </w:r>
-    </w:p>
-    <w:p>
-      <w:pPr>
-        <w:spacing w:after="120"/>
-      </w:pPr>
       <w:r>
-        <w:t>The plan is produced from the survey already carried out — no return visit, no re-measuring, no specialist quantity surveying knowledge — and is issued to the homeowner with the BER documentation, as part of the same job.</w:t>
-      </w:r>
-    </w:p>
-    <w:p>
-      <w:pPr>
-        <w:spacing w:before="200" w:after="60"/>
-      </w:pPr>
-      <w:r>
-        <w:rPr>
-          <w:b/>
-          <w:color w:val="1E293B"/>
-          <w:sz w:val="24"/>
-        </w:rPr>
-        <w:t>One document, and the sector is on the same page</w:t>
+        <w:t xml:space="preserve"> Produced from the survey already done — no return visit, no re-measuring — and issued with the BER documentation as part of the same job.</w:t>
       </w:r>
     </w:p>
     <w:p>
@@ -333,7 +253,7 @@
         <w:spacing w:after="120"/>
       </w:pPr>
       <w:r>
-        <w:t>The wider prize is alignment. Retrofit is delivered by professions that rarely share a document: assessors, contractors, One Stop Shops, lenders and SEAI each hold a different part of the picture, and none of it reconciles.</w:t>
+        <w:t>The result is alignment. The assessor's advice, the contractor's quote, the homeowner's budget, the lender's file and SEAI's grant all reference the same scope and the same published rates. Disputes fall because there is something agreed to point at. That is a benefit to the sector, not a feature of a product, and it is why SEAI's endorsement matters more than any marketing on our side.</w:t>
       </w:r>
     </w:p>
     <w:p>
@@ -341,183 +261,14 @@
         <w:spacing w:after="120"/>
       </w:pPr>
       <w:r>
-        <w:t>A single recognised cost document changes that. The assessor's advice, the contractor's quote, the homeowner's budget, the lender's file and SEAI's grant all reference the same itemised scope and the same published rates:</w:t>
-      </w:r>
-    </w:p>
-    <w:p>
-      <w:pPr>
-        <w:pStyle w:val="ListBullet"/>
-      </w:pPr>
-      <w:r>
         <w:rPr>
           <w:b/>
           <w:color w:val="1E293B"/>
         </w:rPr>
-        <w:t>The homeowner</w:t>
+        <w:t>The document.</w:t>
       </w:r>
       <w:r>
-        <w:t xml:space="preserve"> sees the cost of each measure, the grant against it, and the net figure to fund.</w:t>
-      </w:r>
-    </w:p>
-    <w:p>
-      <w:pPr>
-        <w:pStyle w:val="ListBullet"/>
-      </w:pPr>
-      <w:r>
-        <w:rPr>
-          <w:b/>
-          <w:color w:val="1E293B"/>
-        </w:rPr>
-        <w:t>The contractor</w:t>
-      </w:r>
-      <w:r>
-        <w:t xml:space="preserve"> prices a defined scope that every competitor is pricing too.</w:t>
-      </w:r>
-    </w:p>
-    <w:p>
-      <w:pPr>
-        <w:pStyle w:val="ListBullet"/>
-      </w:pPr>
-      <w:r>
-        <w:rPr>
-          <w:b/>
-          <w:color w:val="1E293B"/>
-        </w:rPr>
-        <w:t>The lender</w:t>
-      </w:r>
-      <w:r>
-        <w:t xml:space="preserve"> receives a consistent cost document that no contractor prepared.</w:t>
-      </w:r>
-    </w:p>
-    <w:p>
-      <w:pPr>
-        <w:pStyle w:val="ListBullet"/>
-      </w:pPr>
-      <w:r>
-        <w:rPr>
-          <w:b/>
-          <w:color w:val="1E293B"/>
-        </w:rPr>
-        <w:t>SEAI</w:t>
-      </w:r>
-      <w:r>
-        <w:t xml:space="preserve"> gets a verifiable statement of intended works, and evidence of what those works actually cost.</w:t>
-      </w:r>
-    </w:p>
-    <w:p>
-      <w:pPr>
-        <w:spacing w:after="120"/>
-      </w:pPr>
-      <w:r>
-        <w:t>Disputes fall because there is something agreed to point at. Trust rises because everyone can see the same working. That is a benefit to the sector rather than a feature of a product, and it is why SEAI's endorsement matters more than any amount of marketing on our side.</w:t>
-      </w:r>
-    </w:p>
-    <w:p>
-      <w:pPr>
-        <w:spacing w:before="200" w:after="60"/>
-      </w:pPr>
-      <w:r>
-        <w:rPr>
-          <w:b/>
-          <w:color w:val="1E293B"/>
-          <w:sz w:val="24"/>
-        </w:rPr>
-        <w:t>What it looks like</w:t>
-      </w:r>
-    </w:p>
-    <w:p>
-      <w:pPr>
-        <w:spacing w:after="120"/>
-      </w:pPr>
-      <w:r>
-        <w:t xml:space="preserve">The Retrofit Cost Plan is a single document that </w:t>
-      </w:r>
-      <w:r>
-        <w:rPr>
-          <w:b/>
-          <w:color w:val="1E293B"/>
-        </w:rPr>
-        <w:t>reconciles to the euro at every level</w:t>
-      </w:r>
-      <w:r>
-        <w:t>:</w:t>
-      </w:r>
-    </w:p>
-    <w:p>
-      <w:pPr>
-        <w:pStyle w:val="ListBullet"/>
-      </w:pPr>
-      <w:r>
-        <w:rPr>
-          <w:b/>
-          <w:color w:val="1E293B"/>
-        </w:rPr>
-        <w:t>Page 1 — the homeowner's summary.</w:t>
-      </w:r>
-      <w:r>
-        <w:t xml:space="preserve"> One row per measure showing scope, estimated spend, SEAI grant and net cost, with an actual-spend column for tracking works as they progress. Written to be read by homeowner, lender and contractor alike, and complete on its own if that is all someone needs.</w:t>
-      </w:r>
-    </w:p>
-    <w:p>
-      <w:pPr>
-        <w:pStyle w:val="ListBullet"/>
-      </w:pPr>
-      <w:r>
-        <w:rPr>
-          <w:b/>
-          <w:color w:val="1E293B"/>
-        </w:rPr>
-        <w:t>The pages that follow — the evidence.</w:t>
-      </w:r>
-      <w:r>
-        <w:t xml:space="preserve"> The full loading methodology, with a total that ties exactly to the headline figure, and an itemised appendix giving every line item with its quantity, unit, material rate and labour rate. Any figure questioned can be traced from the headline down to a unit rate.</w:t>
-      </w:r>
-    </w:p>
-    <w:p>
-      <w:pPr>
-        <w:spacing w:after="120"/>
-      </w:pPr>
-      <w:r>
-        <w:t>The homeowner's page and the evidence behind it stay in one document, so the two can never drift apart.</w:t>
-      </w:r>
-    </w:p>
-    <w:p>
-      <w:pPr>
-        <w:spacing w:after="120"/>
-      </w:pPr>
-      <w:r>
-        <w:t>Alongside these: a per-measure grant breakdown for whichever scheme applies, and the SEAI-registered trades the project requires.</w:t>
-      </w:r>
-    </w:p>
-    <w:p>
-      <w:pPr>
-        <w:spacing w:before="200" w:after="60"/>
-      </w:pPr>
-      <w:r>
-        <w:rPr>
-          <w:b/>
-          <w:color w:val="1E293B"/>
-          <w:sz w:val="24"/>
-        </w:rPr>
-        <w:t>Who produces it, and who relies on it</w:t>
-      </w:r>
-    </w:p>
-    <w:p>
-      <w:pPr>
-        <w:spacing w:after="120"/>
-      </w:pPr>
-      <w:r>
-        <w:t xml:space="preserve">The Retrofit Cost Plan is </w:t>
-      </w:r>
-      <w:r>
-        <w:rPr>
-          <w:b/>
-          <w:color w:val="1E293B"/>
-        </w:rPr>
-        <w:t>produced by the BER assessor</w:t>
-      </w:r>
-      <w:r>
-        <w:t xml:space="preserve"> — the professional who has already surveyed the home and holds the measurements. Everyone else works from the document they issue.</w:t>
+        <w:t xml:space="preserve"> Page 1 is the homeowner's summary — one row per measure with scope, cost, grant and net, plus an actual-spend column for tracking works. The pages behind it are the evidence: the loading methodology totalling exactly to the headline, and an itemised appendix down to unit rates. Both stay in one document so they can never drift apart.</w:t>
       </w:r>
     </w:p>
     <w:tbl>
@@ -555,7 +306,7 @@
                 <w:b/>
                 <w:sz w:val="19"/>
               </w:rPr>
-              <w:t>How they use the Cost Plan</w:t>
+              <w:t>How they use it</w:t>
             </w:r>
           </w:p>
         </w:tc>
@@ -606,7 +357,7 @@
               <w:rPr>
                 <w:sz w:val="19"/>
               </w:rPr>
-              <w:t>Add a costed plan to the improvement advice they already provide, issued with the BER documentation — turning an assessment into a complete, actionable conversation. Built by assessors, so it uses the survey already carried out and asks for no return visit.</w:t>
+              <w:t>Add a costed plan to the advice they already give, issued with the BER documentation. Uses the survey already carried out; no return visit.</w:t>
             </w:r>
           </w:p>
         </w:tc>
@@ -655,7 +406,7 @@
               <w:rPr>
                 <w:sz w:val="19"/>
               </w:rPr>
-              <w:t>Understand the real cost before engaging anyone. Compare quotes against an independent benchmark. Track spend as works progress.</w:t>
+              <w:t>Understand the real cost before engaging anyone; compare quotes against an independent benchmark.</w:t>
             </w:r>
           </w:p>
         </w:tc>
@@ -685,7 +436,7 @@
               <w:rPr>
                 <w:sz w:val="19"/>
               </w:rPr>
-              <w:t>Quote a defined scope that every competitor is pricing too, with a published rate basis to stand over their price. Fewer wasted site visits, fewer scope disputes, and homeowners who arrive ready to proceed.</w:t>
+              <w:t>Quote a defined scope every competitor is pricing too. Fewer wasted site visits, fewer scope disputes.</w:t>
             </w:r>
           </w:p>
         </w:tc>
@@ -715,7 +466,7 @@
               <w:rPr>
                 <w:sz w:val="19"/>
               </w:rPr>
-              <w:t>Price and pre-qualify projects against a common, independent basis, and set client expectations from the outset. Under CEG, where several contractors price parts of one project, a shared itemised scope is what makes those prices comparable.</w:t>
+              <w:t>Price and pre-qualify projects on a common basis. Under CEG, where several contractors price one project, a shared scope is what makes them comparable.</w:t>
             </w:r>
           </w:p>
         </w:tc>
@@ -745,7 +496,7 @@
               <w:rPr>
                 <w:sz w:val="19"/>
               </w:rPr>
-              <w:t>A consistent, contractor-independent cost document to support green loan and mortgage applications.</w:t>
+              <w:t>A consistent, contractor-independent cost document for green loan applications.</w:t>
             </w:r>
           </w:p>
         </w:tc>
@@ -775,7 +526,7 @@
               <w:rPr>
                 <w:sz w:val="19"/>
               </w:rPr>
-              <w:t>Rapid bulk estimation and budget forecasting for estate-wide retrofit programmes.</w:t>
+              <w:t>Bulk estimation and budget forecasting for estate programmes.</w:t>
             </w:r>
           </w:p>
         </w:tc>
@@ -805,37 +556,7 @@
               <w:rPr>
                 <w:sz w:val="19"/>
               </w:rPr>
-              <w:t>Real-market cost evidence to calibrate grant rates, and a consistent way to show homeowners what an upgrade genuinely costs.</w:t>
-            </w:r>
-          </w:p>
-        </w:tc>
-      </w:tr>
-      <w:tr>
-        <w:tc>
-          <w:tcPr>
-            <w:tcW w:type="dxa" w:w="4873"/>
-          </w:tcPr>
-          <w:p>
-            <w:r>
-              <w:rPr>
-                <w:b/>
-                <w:color w:val="1E293B"/>
-                <w:sz w:val="19"/>
-              </w:rPr>
-              <w:t>Estate Agents &amp; Solicitors</w:t>
-            </w:r>
-          </w:p>
-        </w:tc>
-        <w:tc>
-          <w:tcPr>
-            <w:tcW w:type="dxa" w:w="4873"/>
-          </w:tcPr>
-          <w:p>
-            <w:r>
-              <w:rPr>
-                <w:sz w:val="19"/>
-              </w:rPr>
-              <w:t>Retrofit cost disclosure on listings and during transactions.</w:t>
+              <w:t>Real-market cost evidence to calibrate grant rates, and a consistent way to show homeowners what an upgrade costs.</w:t>
             </w:r>
           </w:p>
         </w:tc>
@@ -843,23 +564,17 @@
     </w:tbl>
     <w:p>
       <w:pPr>
-        <w:spacing w:before="200" w:after="60"/>
+        <w:spacing w:after="120"/>
       </w:pPr>
       <w:r>
         <w:rPr>
           <w:b/>
           <w:color w:val="1E293B"/>
-          <w:sz w:val="24"/>
         </w:rPr>
-        <w:t>The three grant routes</w:t>
+        <w:t>The three routes.</w:t>
       </w:r>
-    </w:p>
-    <w:p>
-      <w:pPr>
-        <w:spacing w:after="120"/>
-      </w:pPr>
       <w:r>
-        <w:t>A homeowner reaches the same works through one of three routes, and the Cost Plan prices all three so the choice can be made on evidence:</w:t>
+        <w:t xml:space="preserve"> A homeowner reaches the same works one of three ways, and the Cost Plan prices all three so the choice can be made on evidence.</w:t>
       </w:r>
     </w:p>
     <w:tbl>
@@ -947,7 +662,7 @@
               <w:rPr>
                 <w:sz w:val="19"/>
               </w:rPr>
-              <w:t>Registered One Stop Shop</w:t>
+              <w:t>One Stop Shop</w:t>
             </w:r>
           </w:p>
         </w:tc>
@@ -960,7 +675,7 @@
               <w:rPr>
                 <w:sz w:val="19"/>
               </w:rPr>
-              <w:t>Registered Project Coordinator</w:t>
+              <w:t>Project Coordinator</w:t>
             </w:r>
           </w:p>
         </w:tc>
@@ -1014,7 +729,7 @@
               <w:rPr>
                 <w:sz w:val="19"/>
               </w:rPr>
-              <w:t>Several contractors within an approved project</w:t>
+              <w:t>Several contractors in an approved project</w:t>
             </w:r>
           </w:p>
         </w:tc>
@@ -1068,7 +783,7 @@
               <w:rPr>
                 <w:sz w:val="19"/>
               </w:rPr>
-              <w:t>Project-specific — set within the approved project</w:t>
+              <w:t>Project-specific</w:t>
             </w:r>
           </w:p>
         </w:tc>
@@ -1135,7 +850,7 @@
               <w:rPr>
                 <w:sz w:val="19"/>
               </w:rPr>
-              <w:t>Paid after completion, so the homeowner funds the gross first</w:t>
+              <w:t>After completion — the homeowner funds the gross first</w:t>
             </w:r>
           </w:p>
         </w:tc>
@@ -1163,7 +878,7 @@
               <w:rPr>
                 <w:sz w:val="19"/>
               </w:rPr>
-              <w:t>Included in the provider's single price</w:t>
+              <w:t>Inside the provider's single price</w:t>
             </w:r>
           </w:p>
         </w:tc>
@@ -1176,7 +891,7 @@
               <w:rPr>
                 <w:sz w:val="19"/>
               </w:rPr>
-              <w:t>Itemised by the coordinator — a fixed charge plus an amount per grant measure</w:t>
+              <w:t>Itemised by the coordinator</w:t>
             </w:r>
           </w:p>
         </w:tc>
@@ -1200,15 +915,7 @@
         <w:spacing w:after="120"/>
       </w:pPr>
       <w:r>
-        <w:t>The managed routes carry a real cost that is easy to miss. Someone else runs the project, handles the grant claim and stands behind the result, and they charge for it. The Cost Plan prices that charge as its own line — VAT included, with no contractor's overhead or contingency applied, because it is a professional fee and not works — and shows the project management grant offsetting part of it.</w:t>
-      </w:r>
-    </w:p>
-    <w:p>
-      <w:pPr>
-        <w:spacing w:after="120"/>
-      </w:pPr>
-      <w:r>
-        <w:t xml:space="preserve">On a typical Community Energy Grant project that is a </w:t>
+        <w:t xml:space="preserve">Running a retrofit and claiming the grants costs money, and the plan prices it rather than hiding it. On a typical CEG project that is a </w:t>
       </w:r>
       <w:r>
         <w:rPr>
@@ -1218,25 +925,7 @@
         <w:t>€4,600 administration charge against a €2,000 project management grant</w:t>
       </w:r>
       <w:r>
-        <w:t>: a net cost of €2,600 that a homeowner comparing routes on grant totals alone would never see. Making that visible, rather than showing the grant and hiding the fee, is the whole point of an independent cost document.</w:t>
-      </w:r>
-    </w:p>
-    <w:p>
-      <w:pPr>
-        <w:spacing w:after="120"/>
-      </w:pPr>
-      <w:r>
-        <w:t xml:space="preserve">A One Stop Shop does not itemise it at all — it sits inside their single price — but a route that cannot be compared is a route the homeowner cannot judge. The Cost Plan therefore carries an allowance for it, set above the coordinator basis to reflect one provider running everything where a coordinator model still has contractors competing on price. </w:t>
-      </w:r>
-      <w:r>
-        <w:rPr>
-          <w:b/>
-          <w:color w:val="1E293B"/>
-        </w:rPr>
-        <w:t>That uplift is a working assumption, clearly labelled as provisional on every plan, and replacing it with measured evidence is one of the specific jobs of the pilot.</w:t>
-      </w:r>
-      <w:r>
-        <w:t xml:space="preserve"> The worked examples order as you would expect — One Stop Shop highest, then Community Energy Grant, then Better Energy Homes where the homeowner does the administration themselves — but the size of the gap is exactly what needs proving.</w:t>
+        <w:t xml:space="preserve"> — a €2,600 net cost a homeowner comparing grant totals alone would never see. A One Stop Shop does not itemise it, so the plan carries an allowance above the coordinator basis; that uplift is a working assumption, labelled provisional on every plan, and evidencing it is a specific job of the pilot.</w:t>
       </w:r>
     </w:p>
     <w:p>
@@ -1249,7 +938,7 @@
           <w:color w:val="B07D1A"/>
           <w:sz w:val="30"/>
         </w:rPr>
-        <w:t>2. The Pilot</w:t>
+        <w:t>3. The pilot</w:t>
       </w:r>
     </w:p>
     <w:p>
@@ -1257,52 +946,42 @@
         <w:spacing w:after="120"/>
       </w:pPr>
       <w:r>
-        <w:t>The pilot turns the stated accuracy (±15–20%) into published evidence, tunes the rate and grant tables against real prices, and completes the remaining development — so that what SEAI is asked to recognise has been proven in the field first.</w:t>
+        <w:t>It turns the stated accuracy (±15–20%) into published evidence, tunes the rates and grant tables against real prices, and completes the remaining development — so what SEAI is asked to recognise has been proven first.</w:t>
       </w:r>
     </w:p>
     <w:p>
       <w:pPr>
-        <w:spacing w:after="120"/>
+        <w:pStyle w:val="ListBullet"/>
       </w:pPr>
       <w:r>
         <w:rPr>
           <w:b/>
           <w:color w:val="1E293B"/>
         </w:rPr>
-        <w:t>Validate accuracy against real prices.</w:t>
+        <w:t>Validate accuracy.</w:t>
+      </w:r>
+      <w:r>
+        <w:t xml:space="preserve"> 50–100 live projects against real contractor quotes, across dwelling types, age bands, counties and all three routes. Publish the error distribution per measure, not an average.</w:t>
       </w:r>
     </w:p>
     <w:p>
       <w:pPr>
-        <w:spacing w:after="120"/>
-      </w:pPr>
-      <w:r>
-        <w:t>Run 50–100 live projects through PlanitBER alongside actual contractor quotes and One Stop Shop pricing, spanning dwelling types, age bands, counties and all three grant routes. Publish the error distribution per measure, not merely an average.</w:t>
-      </w:r>
-    </w:p>
-    <w:p>
-      <w:pPr>
-        <w:spacing w:after="120"/>
+        <w:pStyle w:val="ListBullet"/>
       </w:pPr>
       <w:r>
         <w:rPr>
           <w:b/>
           <w:color w:val="1E293B"/>
         </w:rPr>
-        <w:t>Tune the rate book and the grant tables.</w:t>
+        <w:t>Tune the rate book and grant tables.</w:t>
+      </w:r>
+      <w:r>
+        <w:t xml:space="preserve"> Correct what prices high or low, dated and recorded. Test CEG with real coordinator rates rather than assumed ones.</w:t>
       </w:r>
     </w:p>
     <w:p>
       <w:pPr>
-        <w:spacing w:after="120"/>
-      </w:pPr>
-      <w:r>
-        <w:t>Where a measure prices consistently high or low, the rate is corrected and the correction dated and recorded. Grant values are checked against SEAI's published tables at each revision, and the CEG route is tested with real Project Coordinator rates rather than assumed ones.</w:t>
-      </w:r>
-    </w:p>
-    <w:p>
-      <w:pPr>
-        <w:spacing w:after="120"/>
+        <w:pStyle w:val="ListBullet"/>
       </w:pPr>
       <w:r>
         <w:rPr>
@@ -1311,18 +990,13 @@
         </w:rPr>
         <w:t>Prove the assessor workflow.</w:t>
       </w:r>
-    </w:p>
-    <w:p>
-      <w:pPr>
-        <w:spacing w:after="120"/>
-      </w:pPr>
       <w:r>
-        <w:t>Confirm assessors can produce a Cost Plan from a survey they have already carried out — without returning to the property, taking additional measurements, or applying specialist quantity surveying knowledge. Success is the Cost Plan issued to the homeowner alongside the BER documentation, as part of the same job.</w:t>
+        <w:t xml:space="preserve"> A Cost Plan produced from the existing survey, without a return visit or specialist QS knowledge, issued with the BER documentation.</w:t>
       </w:r>
     </w:p>
     <w:p>
       <w:pPr>
-        <w:spacing w:after="120"/>
+        <w:pStyle w:val="ListBullet"/>
       </w:pPr>
       <w:r>
         <w:rPr>
@@ -1331,18 +1005,13 @@
         </w:rPr>
         <w:t>Capture the first actual-cost dataset.</w:t>
       </w:r>
-    </w:p>
-    <w:p>
-      <w:pPr>
-        <w:spacing w:after="120"/>
-      </w:pPr>
       <w:r>
-        <w:t>Estimated-versus-actual figures, per measure and per county, seed a record of retrofit out-turn costs that does not currently exist anywhere in the programme. Aggregated and anonymised, it is a direct output of the pilot.</w:t>
+        <w:t xml:space="preserve"> Estimated-versus-actual per measure and per county — a record that exists nowhere in the programme today.</w:t>
       </w:r>
     </w:p>
     <w:p>
       <w:pPr>
-        <w:spacing w:after="120"/>
+        <w:pStyle w:val="ListBullet"/>
       </w:pPr>
       <w:r>
         <w:rPr>
@@ -1351,13 +1020,8 @@
         </w:rPr>
         <w:t>Complete the development.</w:t>
       </w:r>
-    </w:p>
-    <w:p>
-      <w:pPr>
-        <w:spacing w:after="120"/>
-      </w:pPr>
       <w:r>
-        <w:t>Field use will surface what a demonstration cannot: reporting the sector actually wants, the eligibility rules worth encoding, and the workflow refinements assessors ask for. Energy Upgrade is the module that is ready today. Refurbishment and New Build share the same engine and the same report format, and are in development behind it.</w:t>
+        <w:t xml:space="preserve"> Energy Upgrade is ready now; Refurbishment and New Build share the same engine and follow behind it.</w:t>
       </w:r>
     </w:p>
     <w:p>
@@ -1372,35 +1036,17 @@
         <w:t>Success criteria, stated in advance:</w:t>
       </w:r>
       <w:r>
-        <w:t xml:space="preserve"> measured accuracy within the published band on at least 80% of projects; a Cost Plan issued with the BER documentation on at least 90% of assessments, with no return visit required; a documented rate-correction cycle completed; and homeowner progression from assessment to grant application tracked against a comparison group.</w:t>
+        <w:t xml:space="preserve"> accuracy within the published band on ≥80% of projects; a Cost Plan issued with the BER documentation on ≥90% of assessments with no return visit; a documented rate-correction cycle completed; homeowner progression to grant application tracked against a comparison group. </w:t>
       </w:r>
-    </w:p>
-    <w:p>
-      <w:pPr>
-        <w:spacing w:after="120"/>
-      </w:pPr>
       <w:r>
         <w:rPr>
           <w:b/>
           <w:color w:val="1E293B"/>
         </w:rPr>
-        <w:t>Timeline.</w:t>
+        <w:t>Timeline:</w:t>
       </w:r>
       <w:r>
-        <w:t xml:space="preserve"> Six months from approval: two months recruiting participating assessors, three months collecting projects with matched quotes and actual costs, and a final month for analysis and reporting.</w:t>
-      </w:r>
-    </w:p>
-    <w:p>
-      <w:pPr>
-        <w:spacing w:before="200" w:after="60"/>
-      </w:pPr>
-      <w:r>
-        <w:rPr>
-          <w:b/>
-          <w:color w:val="1E293B"/>
-          <w:sz w:val="24"/>
-        </w:rPr>
-        <w:t>Funding, governance and risk</w:t>
+        <w:t xml:space="preserve"> six months from approval.</w:t>
       </w:r>
     </w:p>
     <w:p>
@@ -1415,15 +1061,7 @@
         <w:t>The funding ask.</w:t>
       </w:r>
       <w:r>
-        <w:t xml:space="preserve"> We are asking SEAI to fund the pilot and deliver it with us: recruiting and supporting participating assessors, collecting and verifying matched quotes and out-turn costs across 50–100 homes, tuning the rate and grant tables against what the projects show, completing the development that field use identifies, and independent analysis of the results.</w:t>
-      </w:r>
-    </w:p>
-    <w:p>
-      <w:pPr>
-        <w:spacing w:after="120"/>
-      </w:pPr>
-      <w:r>
-        <w:t>Three reasons the pilot is worth funding. It produces the evidence that would justify endorsement, which no responsible body should give without it. It produces a public asset: the first structured record of what Irish retrofits actually cost, which becomes SEAI's to hold and publish. And a pilot delivered jointly carries far more weight with assessors, contractors and lenders than one conducted by a private firm alone — which materially affects whether the sector adopts a common standard at all. We would welcome delivery under an existing pilot, research or demonstration programme, on whatever terms SEAI's procedures require.</w:t>
+        <w:t xml:space="preserve"> We are asking SEAI to fund the pilot and deliver it with us — recruiting assessors, collecting and verifying matched quotes and out-turn costs, tuning the tables, completing development, and independent analysis. Not the building of PlanitBER, which is paid for. It is worth funding because it produces the evidence that would justify endorsement, it produces a public asset in the cost dataset, and a jointly delivered pilot carries far more weight with the sector than one run by a private firm alone.</w:t>
       </w:r>
     </w:p>
     <w:p>
@@ -1435,70 +1073,10 @@
           <w:b/>
           <w:color w:val="1E293B"/>
         </w:rPr>
-        <w:t>SEAI oversight.</w:t>
+        <w:t>Governance and risk.</w:t>
       </w:r>
       <w:r>
-        <w:t xml:space="preserve"> Standalone software does not have to mean unsupervised software. We would welcome a formal SEAI role in governing the method: the rate book, the grant tables, their sources and every revision made available for review, with all changes published and dated. If SEAI would prefer to approve the rate book annually, or set parameters the method must apply, we would accept that as a condition of recognition.</w:t>
-      </w:r>
-    </w:p>
-    <w:p>
-      <w:pPr>
-        <w:spacing w:after="120"/>
-      </w:pPr>
-      <w:r>
-        <w:rPr>
-          <w:b/>
-          <w:color w:val="1E293B"/>
-        </w:rPr>
-        <w:t>Keeping it maintained.</w:t>
-      </w:r>
-      <w:r>
-        <w:t xml:space="preserve"> A standard the sector relies on should not rest on one firm's goodwill. It needs a rate book kept current, governance that is documented, and someone accountable for both. We maintain PlanitBER at our own cost today and will do so throughout the pilot. If the Retrofit Cost Plan becomes national infrastructure, we would welcome agreeing a sustainable basis for maintaining and operating it under SEAI's oversight, so that its upkeep is funded and accountable rather than discretionary.</w:t>
-      </w:r>
-    </w:p>
-    <w:p>
-      <w:pPr>
-        <w:spacing w:after="120"/>
-      </w:pPr>
-      <w:r>
-        <w:rPr>
-          <w:b/>
-          <w:color w:val="1E293B"/>
-        </w:rPr>
-        <w:t>Access.</w:t>
-      </w:r>
-      <w:r>
-        <w:t xml:space="preserve"> The Retrofit Cost Plan is free to homeowners. BER assessors access PlanitBER under an annual licence, priced to be recoverable from a single assessment; the level is still to be settled and we would welcome SEAI's view on it. We take no commission, referral fee, lead-generation payment or contractor advertising from any party — independence from everyone selling the works is the point, and it will not be compromised.</w:t>
-      </w:r>
-    </w:p>
-    <w:p>
-      <w:pPr>
-        <w:spacing w:after="120"/>
-      </w:pPr>
-      <w:r>
-        <w:rPr>
-          <w:b/>
-          <w:color w:val="1E293B"/>
-        </w:rPr>
-        <w:t>Liability.</w:t>
-      </w:r>
-      <w:r>
-        <w:t xml:space="preserve"> Every Cost Plan is labelled an indicative estimate — not a quotation, contract or guarantee of final cost — with the accuracy band printed on its face. Professional indemnity insurance is carried by Turley Energy Consultants. Recognition by SEAI would carry no liability for costs incurred by homeowners or contractors.</w:t>
-      </w:r>
-    </w:p>
-    <w:p>
-      <w:pPr>
-        <w:spacing w:after="120"/>
-      </w:pPr>
-      <w:r>
-        <w:rPr>
-          <w:b/>
-          <w:color w:val="1E293B"/>
-        </w:rPr>
-        <w:t>Data protection.</w:t>
-      </w:r>
-      <w:r>
-        <w:t xml:space="preserve"> Project data remains with the assessor who created it. The dataset shared with SEAI is aggregated and anonymised — measure, dwelling type, county and cost only, with no address or personal data — and homeowner consent is obtained before any project's figures are included.</w:t>
+        <w:t xml:space="preserve"> We would welcome a formal SEAI role in governing the method — the rate book, the grant tables, their sources and every revision open to review, with changes published and dated; annual approval if SEAI prefers. Every Cost Plan is labelled an indicative estimate with its accuracy band on its face, and Turley Energy Consultants carries professional indemnity insurance; recognition would carry no liability for SEAI. Data shared with SEAI is aggregated and anonymised, with homeowner consent. The Cost Plan is free to homeowners; assessors access PlanitBER under an annual licence, priced to be recoverable from a single assessment, and we take no commission, referral fee or contractor advertising from anyone.</w:t>
       </w:r>
     </w:p>
     <w:p>
@@ -1511,7 +1089,23 @@
           <w:color w:val="B07D1A"/>
           <w:sz w:val="30"/>
         </w:rPr>
-        <w:t>3. What It Can Become</w:t>
+        <w:t>4. What it can become</w:t>
+      </w:r>
+    </w:p>
+    <w:p>
+      <w:pPr>
+        <w:spacing w:after="120"/>
+      </w:pPr>
+      <w:r>
+        <w:t>Ireland completes roughly 100,000 assessments a year and almost none leave the homeowner with a credible number. Recognition would make the Retrofit Cost Plan the consistent format in which that number is given nationwide — the examples in this pack are drawn from two counties at opposite ends of the labour-cost range to show the same specification correctly regionalised.</w:t>
+      </w:r>
+    </w:p>
+    <w:p>
+      <w:pPr>
+        <w:spacing w:after="120"/>
+      </w:pPr>
+      <w:r>
+        <w:t>At scale the estimated-versus-actual dataset becomes a live index of retrofit costs by measure, dwelling type and county: the reference SEAI needs to calibrate grant rates and demonstrate value for money. Beyond that, SEAI's eligibility rules can be built into the method so a plan that prices a grant is a plan that qualifies for it; and the Cost Plan becomes the standard cost document for retrofit lending, which banks currently lack.</w:t>
       </w:r>
     </w:p>
     <w:p>
@@ -1523,114 +1117,7 @@
           <w:b/>
           <w:color w:val="1E293B"/>
         </w:rPr>
-        <w:t>A recognised standard, applied consistently nationwide.</w:t>
-      </w:r>
-    </w:p>
-    <w:p>
-      <w:pPr>
-        <w:spacing w:after="120"/>
-      </w:pPr>
-      <w:r>
-        <w:t>Ireland completes roughly 100,000 home energy assessments a year, and almost none of them leave the homeowner with a credible number. Recognition would make the Retrofit Cost Plan the consistent format in which that number is given — the same method, loading basis and grant treatment whether the homeowner is in Dublin or Westport. The worked examples in this pack are deliberately drawn from two counties at opposite ends of the labour-cost range, so the same house specification produces different, correctly regionalised figures.</w:t>
-      </w:r>
-    </w:p>
-    <w:p>
-      <w:pPr>
-        <w:spacing w:after="120"/>
-      </w:pPr>
-      <w:r>
-        <w:rPr>
-          <w:b/>
-          <w:color w:val="1E293B"/>
-        </w:rPr>
-        <w:t>A better deal for the people delivering retrofit.</w:t>
-      </w:r>
-    </w:p>
-    <w:p>
-      <w:pPr>
-        <w:spacing w:after="120"/>
-      </w:pPr>
-      <w:r>
-        <w:t xml:space="preserve">Assessors are best placed to produce this — they have already surveyed the home, already hold the measurements, and are already trusted to advise on improvements. The Retrofit Cost Plan extends that advice from </w:t>
-      </w:r>
-      <w:r>
-        <w:rPr>
-          <w:i/>
-        </w:rPr>
-        <w:t>what to do</w:t>
-      </w:r>
-      <w:r>
-        <w:t xml:space="preserve"> to </w:t>
-      </w:r>
-      <w:r>
-        <w:rPr>
-          <w:i/>
-        </w:rPr>
-        <w:t>what it costs</w:t>
-      </w:r>
-      <w:r>
-        <w:t>, using the survey already completed. That makes the assessment more valuable to the homeowner and more commercially attractive to the assessor.</w:t>
-      </w:r>
-    </w:p>
-    <w:p>
-      <w:pPr>
-        <w:spacing w:after="120"/>
-      </w:pPr>
-      <w:r>
-        <w:t>Contractors gain from the same document. When every quote prices the same itemised scope, the lowest price is genuinely the best value rather than the one that omitted the most. Site visits stop being wasted on enquiries that were never going to proceed. Mid-job disputes and variations fall because the scope was agreed in writing beforehand. And better-informed homeowners convert into work that would otherwise have stalled at the quote stage.</w:t>
-      </w:r>
-    </w:p>
-    <w:p>
-      <w:pPr>
-        <w:spacing w:after="120"/>
-      </w:pPr>
-      <w:r>
-        <w:rPr>
-          <w:b/>
-          <w:color w:val="1E293B"/>
-        </w:rPr>
-        <w:t>A national retrofit cost index.</w:t>
-      </w:r>
-    </w:p>
-    <w:p>
-      <w:pPr>
-        <w:spacing w:after="120"/>
-      </w:pPr>
-      <w:r>
-        <w:t>At scale, the estimated-versus-actual dataset becomes a live index of retrofit costs by measure, dwelling type and county — the reference SEAI needs to calibrate grant rates, identify regional price anomalies and demonstrate value for money. Nobody holds this data today, and the document producing the estimates is the natural instrument to collect the outcomes.</w:t>
-      </w:r>
-    </w:p>
-    <w:p>
-      <w:pPr>
-        <w:spacing w:after="120"/>
-      </w:pPr>
-      <w:r>
-        <w:rPr>
-          <w:b/>
-          <w:color w:val="1E293B"/>
-        </w:rPr>
-        <w:t>Where it goes next.</w:t>
-      </w:r>
-    </w:p>
-    <w:p>
-      <w:pPr>
-        <w:spacing w:after="120"/>
-      </w:pPr>
-      <w:r>
-        <w:t>Three developments follow naturally once accuracy is evidenced. SEAI's eligibility rules — year-of-construction thresholds, the post-works Heat Loss Indicator requirement for heat pump grants, measure-combination rules — can be built into the method, so a plan that prices a grant is a plan that qualifies for it. The Cost Plan becomes the standard supporting document for retrofit lending, which banks and credit unions currently lack. And, in time, it could support grant applications themselves: a consistent, itemised statement of intended works at application stage, and a benchmark against which final invoices can be sense-checked.</w:t>
-      </w:r>
-    </w:p>
-    <w:p>
-      <w:pPr>
-        <w:spacing w:before="200" w:after="60"/>
-      </w:pPr>
-      <w:r>
-        <w:rPr>
-          <w:b/>
-          <w:color w:val="1E293B"/>
-          <w:sz w:val="24"/>
-        </w:rPr>
-        <w:t>The path we propose</w:t>
+        <w:t>The path we propose:</w:t>
       </w:r>
     </w:p>
     <w:p>
@@ -1653,7 +1140,7 @@
         <w:t>Funded pilot</w:t>
       </w:r>
       <w:r>
-        <w:t xml:space="preserve"> — delivered in partnership with SEAI: accuracy report, tuned rate and grant tables, actual-cost dataset and rate governance.</w:t>
+        <w:t xml:space="preserve"> — accuracy report, tuned rates and grant tables, actual-cost dataset, rate governance.</w:t>
       </w:r>
     </w:p>
     <w:p>
@@ -1676,7 +1163,7 @@
         <w:t>Recognition</w:t>
       </w:r>
       <w:r>
-        <w:t xml:space="preserve"> — the Retrofit Cost Plan recognised as a standard cost document, and PlanitBER as the means of producing it, backed by our published rate-maintenance commitment and whatever oversight arrangement SEAI wishes to put in place.</w:t>
+        <w:t xml:space="preserve"> — the Retrofit Cost Plan as a standard cost document, PlanitBER as the means of producing it.</w:t>
       </w:r>
     </w:p>
     <w:p>
@@ -1699,7 +1186,7 @@
         <w:t>Wider role</w:t>
       </w:r>
       <w:r>
-        <w:t xml:space="preserve"> — subject to proven accuracy, use of the Cost Plan to support retrofit lending and, in time, grant applications.</w:t>
+        <w:t xml:space="preserve"> — subject to proven accuracy, supporting retrofit lending and, in time, grant applications.</w:t>
       </w:r>
     </w:p>
     <w:p>
@@ -1707,15 +1194,7 @@
         <w:spacing w:after="120"/>
       </w:pPr>
       <w:r>
-        <w:t>Each step produces something concrete — evidence, cost data, higher homeowner conversion — before the next is asked for.</w:t>
-      </w:r>
-    </w:p>
-    <w:p>
-      <w:pPr>
-        <w:spacing w:after="120"/>
-      </w:pPr>
-      <w:r>
-        <w:t>What we are seeking is a partner rather than a customer: joint delivery of the pilot, shared oversight of the method, findings that belong to the sector rather than to us, and a common cost document that assessors, contractors, lenders and homeowners all recognise. The retrofit sector needs a cost standard it can trust, and a standard the industry trusts is one SEAI stands over. We would rather build that with SEAI than alongside it.</w:t>
+        <w:t>Each step produces something concrete before the next is asked for. What we are seeking is a partner rather than a customer: joint delivery, shared oversight, findings that belong to the sector. A standard the industry trusts is one SEAI stands over, and we would rather build that with SEAI than alongside it.</w:t>
       </w:r>
     </w:p>
     <w:p>

</xml_diff>

<commit_message>
Schedule: one pricing column, company name, no boxed note
Price and the unheaded column beside it are now a single wide column.
A contractor writing a price and a caveat about it was splitting one
thought across two cells; together they are one space, and it is wider
than either was.

The header asks for a Company name rather than a Contractor — it is a
firm that quotes, not a person.

The boxed note under the table is gone. It said the schedule is for
comparing quotations on the same basis, that quantities are to be
confirmed, and that it does not form a contract. The first two are
already said where they matter — in the line under the column headings —
and the third was the only load-bearing part.

Value proposition caption and prose follow: they described a blank
column beside the price that no longer exists.

Co-Authored-By: Claude Opus 5 <noreply@anthropic.com>
Claude-Session: https://claude.ai/code/session_017c6VtAdYwGJhpVqbEFh3tW
</commit_message>
<xml_diff>
--- a/PlanitBER_Value_Proposition.docx
+++ b/PlanitBER_Value_Proposition.docx
@@ -959,7 +959,7 @@
         <w:t>The pricing schedule.</w:t>
       </w:r>
       <w:r>
-        <w:t xml:space="preserve"> The same engine produces a second document the homeowner can issue: the same measures and the same measured quantities, with the prices left blank. They send it to as many contractors as they like. This is ordinary practice in commercial building — a quantity surveyor issues a priced schedule and every tenderer fills in the same one. All that is different here is that a homeowner is doing it. Because each contractor prices the same scope, the figures that come back can be compared with each other and with the Cost Plan’s own estimate. Quantities are shown as the assessor’s measurement, and a contractor can confirm them, amend them, or use the blank column beside the price for anything else they need to say.</w:t>
+        <w:t xml:space="preserve"> The same engine produces a second document the homeowner can issue: the same measures and the same measured quantities, with the prices left blank. They send it to as many contractors as they like. This is ordinary practice in commercial building — a quantity surveyor issues a priced schedule and every tenderer fills in the same one. All that is different here is that a homeowner is doing it. Because each contractor prices the same scope, the figures that come back can be compared with each other and with the Cost Plan’s own estimate. Quantities are shown as the assessor’s measurement, and a contractor can confirm them, amend them, and there is room in the price column to note anything else — an alternative specification, an access problem, a lead time.</w:t>
       </w:r>
     </w:p>
     <w:p>
@@ -969,7 +969,7 @@
       <w:r>
         <w:drawing>
           <wp:inline xmlns:a="http://schemas.openxmlformats.org/drawingml/2006/main" xmlns:pic="http://schemas.openxmlformats.org/drawingml/2006/picture">
-            <wp:extent cx="5760720" cy="4568501"/>
+            <wp:extent cx="5760720" cy="4393175"/>
             <wp:docPr id="954" name="Picture 954"/>
             <wp:cNvGraphicFramePr>
               <a:graphicFrameLocks noChangeAspect="1"/>
@@ -990,7 +990,7 @@
                   <pic:spPr>
                     <a:xfrm>
                       <a:off x="0" y="0"/>
-                      <a:ext cx="5760720" cy="4568501"/>
+                      <a:ext cx="5760720" cy="4393175"/>
                     </a:xfrm>
                     <a:prstGeom prst="rect"/>
                   </pic:spPr>
@@ -1011,7 +1011,7 @@
           <w:color w:val="64748B"/>
           <w:sz w:val="16"/>
         </w:rPr>
-        <w:t>The pricing schedule as it is issued — the same measures and the same measured quantities as the Cost Plan, and no prices anywhere on it. The contractor fills in the price column; the blank column beside it is theirs to use.</w:t>
+        <w:t>The pricing schedule as it is issued — the same measures and the same measured quantities as the Cost Plan, and no prices anywhere on it. The contractor writes their price on the rule, with room beside it for anything they want to add.</w:t>
       </w:r>
     </w:p>
     <w:p>

</xml_diff>